<commit_message>
updated figures / plots
</commit_message>
<xml_diff>
--- a/output/tables/06.Tables_Unadjusted_Models.docx
+++ b/output/tables/06.Tables_Unadjusted_Models.docx
@@ -11276,6 +11276,1126 @@
                 <w:color w:val="8C8C8C"/>
               </w:rPr>
               <w:t xml:space="preserve">0.254</w:t>
+            </w:r>
+          </w:p>
+        </w:tc>
+      </w:tr>
+      <w:tr>
+        <w:trPr>
+          <w:trHeight w:val="360" w:hRule="auto"/>
+        </w:trPr>
+        <w:tc>
+          <w:tcPr>
+            <w:tcBorders>
+              <w:bottom w:val="single" w:sz="4" w:space="0" w:color="BDC3C7"/>
+              <w:top w:val="single" w:sz="4" w:space="0" w:color="BDC3C7"/>
+              <w:left w:val="none" w:sz="0" w:space="0" w:color="000000"/>
+              <w:right w:val="none" w:sz="0" w:space="0" w:color="000000"/>
+            </w:tcBorders>
+            <w:shd w:val="clear" w:color="auto" w:fill="F9F9F9"/>
+            <w:tcMar>
+              <w:top w:w="0" w:type="dxa"/>
+              <w:bottom w:w="0" w:type="dxa"/>
+              <w:left w:w="0" w:type="dxa"/>
+              <w:right w:w="0" w:type="dxa"/>
+            </w:tcMar>
+            <w:vAlign w:val="center"/>
+          </w:tcPr>
+          <w:p>
+            <w:pPr>
+              <w:pStyle w:val="Normal"/>
+              <w:jc w:val="left"/>
+              <w:pBdr>
+                <w:bottom w:val="none" w:sz="0" w:space="0" w:color="000000"/>
+                <w:top w:val="none" w:sz="0" w:space="0" w:color="000000"/>
+                <w:left w:val="none" w:sz="0" w:space="0" w:color="000000"/>
+                <w:right w:val="none" w:sz="0" w:space="0" w:color="000000"/>
+              </w:pBdr>
+              <w:spacing w:after="40" w:before="40" w:line="240"/>
+              <w:ind w:left="100" w:right="100" w:firstLine="0" w:firstLineChars="0"/>
+              <w:rPr>
+                <w:rFonts w:ascii="Calibri" w:hAnsi="Calibri" w:eastAsia="Calibri" w:cs="Calibri"/>
+                <w:i w:val="false"/>
+                <w:b w:val="false"/>
+                <w:u w:val="none"/>
+                <w:strike w:val="false"/>
+                <w:sz w:val="20"/>
+                <w:szCs w:val="20"/>
+                <w:color w:val="000000"/>
+              </w:rPr>
+            </w:pPr>
+            <w:r>
+              <w:rPr>
+                <w:rFonts w:ascii="Calibri" w:hAnsi="Calibri" w:eastAsia="Calibri" w:cs="Calibri"/>
+                <w:i w:val="false"/>
+                <w:b w:val="false"/>
+                <w:u w:val="none"/>
+                <w:strike w:val="false"/>
+                <w:sz w:val="20"/>
+                <w:szCs w:val="20"/>
+                <w:color w:val="000000"/>
+              </w:rPr>
+              <w:t xml:space="preserve">Neighborhood water quality vs. own: Same (ref: Better)</w:t>
+            </w:r>
+          </w:p>
+        </w:tc>
+        <w:tc>
+          <w:tcPr>
+            <w:tcBorders>
+              <w:bottom w:val="single" w:sz="4" w:space="0" w:color="BDC3C7"/>
+              <w:top w:val="single" w:sz="4" w:space="0" w:color="BDC3C7"/>
+              <w:left w:val="none" w:sz="0" w:space="0" w:color="000000"/>
+              <w:right w:val="none" w:sz="0" w:space="0" w:color="000000"/>
+            </w:tcBorders>
+            <w:shd w:val="clear" w:color="auto" w:fill="F9F9F9"/>
+            <w:tcMar>
+              <w:top w:w="0" w:type="dxa"/>
+              <w:bottom w:w="0" w:type="dxa"/>
+              <w:left w:w="0" w:type="dxa"/>
+              <w:right w:w="0" w:type="dxa"/>
+            </w:tcMar>
+            <w:vAlign w:val="center"/>
+          </w:tcPr>
+          <w:p>
+            <w:pPr>
+              <w:pStyle w:val="Normal"/>
+              <w:jc w:val="center"/>
+              <w:pBdr>
+                <w:bottom w:val="none" w:sz="0" w:space="0" w:color="000000"/>
+                <w:top w:val="none" w:sz="0" w:space="0" w:color="000000"/>
+                <w:left w:val="none" w:sz="0" w:space="0" w:color="000000"/>
+                <w:right w:val="none" w:sz="0" w:space="0" w:color="000000"/>
+              </w:pBdr>
+              <w:spacing w:after="40" w:before="40" w:line="240"/>
+              <w:ind w:left="100" w:right="100" w:firstLine="0" w:firstLineChars="0"/>
+              <w:rPr>
+                <w:rFonts w:ascii="Calibri" w:hAnsi="Calibri" w:eastAsia="Calibri" w:cs="Calibri"/>
+                <w:i w:val="false"/>
+                <w:b w:val="false"/>
+                <w:u w:val="none"/>
+                <w:strike w:val="false"/>
+                <w:sz w:val="20"/>
+                <w:szCs w:val="20"/>
+                <w:color w:val="000000"/>
+              </w:rPr>
+            </w:pPr>
+            <w:r>
+              <w:rPr>
+                <w:rFonts w:ascii="Calibri" w:hAnsi="Calibri" w:eastAsia="Calibri" w:cs="Calibri"/>
+                <w:i w:val="false"/>
+                <w:b w:val="false"/>
+                <w:u w:val="none"/>
+                <w:strike w:val="false"/>
+                <w:sz w:val="20"/>
+                <w:szCs w:val="20"/>
+                <w:color w:val="000000"/>
+              </w:rPr>
+              <w:t xml:space="preserve">393</w:t>
+            </w:r>
+          </w:p>
+        </w:tc>
+        <w:tc>
+          <w:tcPr>
+            <w:tcBorders>
+              <w:bottom w:val="single" w:sz="4" w:space="0" w:color="BDC3C7"/>
+              <w:top w:val="single" w:sz="4" w:space="0" w:color="BDC3C7"/>
+              <w:left w:val="none" w:sz="0" w:space="0" w:color="000000"/>
+              <w:right w:val="none" w:sz="0" w:space="0" w:color="000000"/>
+            </w:tcBorders>
+            <w:shd w:val="clear" w:color="auto" w:fill="F9F9F9"/>
+            <w:tcMar>
+              <w:top w:w="0" w:type="dxa"/>
+              <w:bottom w:w="0" w:type="dxa"/>
+              <w:left w:w="0" w:type="dxa"/>
+              <w:right w:w="0" w:type="dxa"/>
+            </w:tcMar>
+            <w:vAlign w:val="center"/>
+          </w:tcPr>
+          <w:p>
+            <w:pPr>
+              <w:pStyle w:val="Normal"/>
+              <w:jc w:val="center"/>
+              <w:pBdr>
+                <w:bottom w:val="none" w:sz="0" w:space="0" w:color="000000"/>
+                <w:top w:val="none" w:sz="0" w:space="0" w:color="000000"/>
+                <w:left w:val="none" w:sz="0" w:space="0" w:color="000000"/>
+                <w:right w:val="none" w:sz="0" w:space="0" w:color="000000"/>
+              </w:pBdr>
+              <w:spacing w:after="40" w:before="40" w:line="240"/>
+              <w:ind w:left="100" w:right="100" w:firstLine="0" w:firstLineChars="0"/>
+              <w:rPr>
+                <w:rFonts w:ascii="Calibri" w:hAnsi="Calibri" w:eastAsia="Calibri" w:cs="Calibri"/>
+                <w:i w:val="false"/>
+                <w:b w:val="false"/>
+                <w:u w:val="none"/>
+                <w:strike w:val="false"/>
+                <w:sz w:val="20"/>
+                <w:szCs w:val="20"/>
+                <w:color w:val="000000"/>
+              </w:rPr>
+            </w:pPr>
+            <w:r>
+              <w:rPr>
+                <w:rFonts w:ascii="Calibri" w:hAnsi="Calibri" w:eastAsia="Calibri" w:cs="Calibri"/>
+                <w:i w:val="false"/>
+                <w:b w:val="false"/>
+                <w:u w:val="none"/>
+                <w:strike w:val="false"/>
+                <w:sz w:val="20"/>
+                <w:szCs w:val="20"/>
+                <w:color w:val="000000"/>
+              </w:rPr>
+              <w:t xml:space="preserve">-0.14 [-2.01, 1.73]</w:t>
+            </w:r>
+          </w:p>
+        </w:tc>
+        <w:tc>
+          <w:tcPr>
+            <w:tcBorders>
+              <w:bottom w:val="single" w:sz="4" w:space="0" w:color="BDC3C7"/>
+              <w:top w:val="single" w:sz="4" w:space="0" w:color="BDC3C7"/>
+              <w:left w:val="none" w:sz="0" w:space="0" w:color="000000"/>
+              <w:right w:val="none" w:sz="0" w:space="0" w:color="000000"/>
+            </w:tcBorders>
+            <w:shd w:val="clear" w:color="auto" w:fill="F9F9F9"/>
+            <w:tcMar>
+              <w:top w:w="0" w:type="dxa"/>
+              <w:bottom w:w="0" w:type="dxa"/>
+              <w:left w:w="0" w:type="dxa"/>
+              <w:right w:w="0" w:type="dxa"/>
+            </w:tcMar>
+            <w:vAlign w:val="center"/>
+          </w:tcPr>
+          <w:p>
+            <w:pPr>
+              <w:pStyle w:val="Normal"/>
+              <w:jc w:val="center"/>
+              <w:pBdr>
+                <w:bottom w:val="none" w:sz="0" w:space="0" w:color="000000"/>
+                <w:top w:val="none" w:sz="0" w:space="0" w:color="000000"/>
+                <w:left w:val="none" w:sz="0" w:space="0" w:color="000000"/>
+                <w:right w:val="none" w:sz="0" w:space="0" w:color="000000"/>
+              </w:pBdr>
+              <w:spacing w:after="40" w:before="40" w:line="240"/>
+              <w:ind w:left="100" w:right="100" w:firstLine="0" w:firstLineChars="0"/>
+              <w:rPr>
+                <w:rFonts w:ascii="Calibri" w:hAnsi="Calibri" w:eastAsia="Calibri" w:cs="Calibri"/>
+                <w:i w:val="false"/>
+                <w:b w:val="false"/>
+                <w:u w:val="none"/>
+                <w:strike w:val="false"/>
+                <w:sz w:val="20"/>
+                <w:szCs w:val="20"/>
+                <w:color w:val="000000"/>
+              </w:rPr>
+            </w:pPr>
+            <w:r>
+              <w:rPr>
+                <w:rFonts w:ascii="Calibri" w:hAnsi="Calibri" w:eastAsia="Calibri" w:cs="Calibri"/>
+                <w:i w:val="false"/>
+                <w:b w:val="false"/>
+                <w:u w:val="none"/>
+                <w:strike w:val="false"/>
+                <w:sz w:val="20"/>
+                <w:szCs w:val="20"/>
+                <w:color w:val="000000"/>
+              </w:rPr>
+              <w:t xml:space="preserve">2,677.6</w:t>
+            </w:r>
+          </w:p>
+        </w:tc>
+        <w:tc>
+          <w:tcPr>
+            <w:tcBorders>
+              <w:bottom w:val="single" w:sz="4" w:space="0" w:color="BDC3C7"/>
+              <w:top w:val="single" w:sz="4" w:space="0" w:color="BDC3C7"/>
+              <w:left w:val="none" w:sz="0" w:space="0" w:color="000000"/>
+              <w:right w:val="none" w:sz="0" w:space="0" w:color="000000"/>
+            </w:tcBorders>
+            <w:shd w:val="clear" w:color="auto" w:fill="F9F9F9"/>
+            <w:tcMar>
+              <w:top w:w="0" w:type="dxa"/>
+              <w:bottom w:w="0" w:type="dxa"/>
+              <w:left w:w="0" w:type="dxa"/>
+              <w:right w:w="0" w:type="dxa"/>
+            </w:tcMar>
+            <w:vAlign w:val="center"/>
+          </w:tcPr>
+          <w:p>
+            <w:pPr>
+              <w:pStyle w:val="Normal"/>
+              <w:jc w:val="center"/>
+              <w:pBdr>
+                <w:bottom w:val="none" w:sz="0" w:space="0" w:color="000000"/>
+                <w:top w:val="none" w:sz="0" w:space="0" w:color="000000"/>
+                <w:left w:val="none" w:sz="0" w:space="0" w:color="000000"/>
+                <w:right w:val="none" w:sz="0" w:space="0" w:color="000000"/>
+              </w:pBdr>
+              <w:spacing w:after="40" w:before="40" w:line="240"/>
+              <w:ind w:left="100" w:right="100" w:firstLine="0" w:firstLineChars="0"/>
+              <w:rPr>
+                <w:rFonts w:ascii="Calibri" w:hAnsi="Calibri" w:eastAsia="Calibri" w:cs="Calibri"/>
+                <w:i w:val="false"/>
+                <w:b w:val="false"/>
+                <w:u w:val="none"/>
+                <w:strike w:val="false"/>
+                <w:sz w:val="20"/>
+                <w:szCs w:val="20"/>
+                <w:color w:val="8C8C8C"/>
+              </w:rPr>
+            </w:pPr>
+            <w:r>
+              <w:rPr>
+                <w:rFonts w:ascii="Calibri" w:hAnsi="Calibri" w:eastAsia="Calibri" w:cs="Calibri"/>
+                <w:i w:val="false"/>
+                <w:b w:val="false"/>
+                <w:u w:val="none"/>
+                <w:strike w:val="false"/>
+                <w:sz w:val="20"/>
+                <w:szCs w:val="20"/>
+                <w:color w:val="8C8C8C"/>
+              </w:rPr>
+              <w:t xml:space="preserve">0.882</w:t>
+            </w:r>
+          </w:p>
+        </w:tc>
+      </w:tr>
+      <w:tr>
+        <w:trPr>
+          <w:trHeight w:val="360" w:hRule="auto"/>
+        </w:trPr>
+        <w:tc>
+          <w:tcPr>
+            <w:tcBorders>
+              <w:bottom w:val="single" w:sz="4" w:space="0" w:color="BDC3C7"/>
+              <w:top w:val="single" w:sz="4" w:space="0" w:color="BDC3C7"/>
+              <w:left w:val="none" w:sz="0" w:space="0" w:color="000000"/>
+              <w:right w:val="none" w:sz="0" w:space="0" w:color="000000"/>
+            </w:tcBorders>
+            <w:shd w:val="clear" w:color="auto" w:fill="F9F9F9"/>
+            <w:tcMar>
+              <w:top w:w="0" w:type="dxa"/>
+              <w:bottom w:w="0" w:type="dxa"/>
+              <w:left w:w="0" w:type="dxa"/>
+              <w:right w:w="0" w:type="dxa"/>
+            </w:tcMar>
+            <w:vAlign w:val="center"/>
+          </w:tcPr>
+          <w:p>
+            <w:pPr>
+              <w:pStyle w:val="Normal"/>
+              <w:jc w:val="left"/>
+              <w:pBdr>
+                <w:bottom w:val="none" w:sz="0" w:space="0" w:color="000000"/>
+                <w:top w:val="none" w:sz="0" w:space="0" w:color="000000"/>
+                <w:left w:val="none" w:sz="0" w:space="0" w:color="000000"/>
+                <w:right w:val="none" w:sz="0" w:space="0" w:color="000000"/>
+              </w:pBdr>
+              <w:spacing w:after="40" w:before="40" w:line="240"/>
+              <w:ind w:left="100" w:right="100" w:firstLine="0" w:firstLineChars="0"/>
+              <w:rPr>
+                <w:rFonts w:ascii="Calibri" w:hAnsi="Calibri" w:eastAsia="Calibri" w:cs="Calibri"/>
+                <w:i w:val="false"/>
+                <w:b w:val="false"/>
+                <w:u w:val="none"/>
+                <w:strike w:val="false"/>
+                <w:sz w:val="20"/>
+                <w:szCs w:val="20"/>
+                <w:color w:val="000000"/>
+              </w:rPr>
+            </w:pPr>
+            <w:r>
+              <w:rPr>
+                <w:rFonts w:ascii="Calibri" w:hAnsi="Calibri" w:eastAsia="Calibri" w:cs="Calibri"/>
+                <w:i w:val="false"/>
+                <w:b w:val="false"/>
+                <w:u w:val="none"/>
+                <w:strike w:val="false"/>
+                <w:sz w:val="20"/>
+                <w:szCs w:val="20"/>
+                <w:color w:val="000000"/>
+              </w:rPr>
+              <w:t xml:space="preserve">Neighborhood water quality vs. own: Worse (ref: Better)</w:t>
+            </w:r>
+          </w:p>
+        </w:tc>
+        <w:tc>
+          <w:tcPr>
+            <w:tcBorders>
+              <w:bottom w:val="single" w:sz="4" w:space="0" w:color="BDC3C7"/>
+              <w:top w:val="single" w:sz="4" w:space="0" w:color="BDC3C7"/>
+              <w:left w:val="none" w:sz="0" w:space="0" w:color="000000"/>
+              <w:right w:val="none" w:sz="0" w:space="0" w:color="000000"/>
+            </w:tcBorders>
+            <w:shd w:val="clear" w:color="auto" w:fill="F9F9F9"/>
+            <w:tcMar>
+              <w:top w:w="0" w:type="dxa"/>
+              <w:bottom w:w="0" w:type="dxa"/>
+              <w:left w:w="0" w:type="dxa"/>
+              <w:right w:w="0" w:type="dxa"/>
+            </w:tcMar>
+            <w:vAlign w:val="center"/>
+          </w:tcPr>
+          <w:p>
+            <w:pPr>
+              <w:pStyle w:val="Normal"/>
+              <w:jc w:val="center"/>
+              <w:pBdr>
+                <w:bottom w:val="none" w:sz="0" w:space="0" w:color="000000"/>
+                <w:top w:val="none" w:sz="0" w:space="0" w:color="000000"/>
+                <w:left w:val="none" w:sz="0" w:space="0" w:color="000000"/>
+                <w:right w:val="none" w:sz="0" w:space="0" w:color="000000"/>
+              </w:pBdr>
+              <w:spacing w:after="40" w:before="40" w:line="240"/>
+              <w:ind w:left="100" w:right="100" w:firstLine="0" w:firstLineChars="0"/>
+              <w:rPr>
+                <w:rFonts w:ascii="Calibri" w:hAnsi="Calibri" w:eastAsia="Calibri" w:cs="Calibri"/>
+                <w:i w:val="false"/>
+                <w:b w:val="false"/>
+                <w:u w:val="none"/>
+                <w:strike w:val="false"/>
+                <w:sz w:val="20"/>
+                <w:szCs w:val="20"/>
+                <w:color w:val="000000"/>
+              </w:rPr>
+            </w:pPr>
+            <w:r>
+              <w:rPr>
+                <w:rFonts w:ascii="Calibri" w:hAnsi="Calibri" w:eastAsia="Calibri" w:cs="Calibri"/>
+                <w:i w:val="false"/>
+                <w:b w:val="false"/>
+                <w:u w:val="none"/>
+                <w:strike w:val="false"/>
+                <w:sz w:val="20"/>
+                <w:szCs w:val="20"/>
+                <w:color w:val="000000"/>
+              </w:rPr>
+              <w:t xml:space="preserve">393</w:t>
+            </w:r>
+          </w:p>
+        </w:tc>
+        <w:tc>
+          <w:tcPr>
+            <w:tcBorders>
+              <w:bottom w:val="single" w:sz="4" w:space="0" w:color="BDC3C7"/>
+              <w:top w:val="single" w:sz="4" w:space="0" w:color="BDC3C7"/>
+              <w:left w:val="none" w:sz="0" w:space="0" w:color="000000"/>
+              <w:right w:val="none" w:sz="0" w:space="0" w:color="000000"/>
+            </w:tcBorders>
+            <w:shd w:val="clear" w:color="auto" w:fill="F9F9F9"/>
+            <w:tcMar>
+              <w:top w:w="0" w:type="dxa"/>
+              <w:bottom w:w="0" w:type="dxa"/>
+              <w:left w:w="0" w:type="dxa"/>
+              <w:right w:w="0" w:type="dxa"/>
+            </w:tcMar>
+            <w:vAlign w:val="center"/>
+          </w:tcPr>
+          <w:p>
+            <w:pPr>
+              <w:pStyle w:val="Normal"/>
+              <w:jc w:val="center"/>
+              <w:pBdr>
+                <w:bottom w:val="none" w:sz="0" w:space="0" w:color="000000"/>
+                <w:top w:val="none" w:sz="0" w:space="0" w:color="000000"/>
+                <w:left w:val="none" w:sz="0" w:space="0" w:color="000000"/>
+                <w:right w:val="none" w:sz="0" w:space="0" w:color="000000"/>
+              </w:pBdr>
+              <w:spacing w:after="40" w:before="40" w:line="240"/>
+              <w:ind w:left="100" w:right="100" w:firstLine="0" w:firstLineChars="0"/>
+              <w:rPr>
+                <w:rFonts w:ascii="Calibri" w:hAnsi="Calibri" w:eastAsia="Calibri" w:cs="Calibri"/>
+                <w:i w:val="false"/>
+                <w:b w:val="false"/>
+                <w:u w:val="none"/>
+                <w:strike w:val="false"/>
+                <w:sz w:val="20"/>
+                <w:szCs w:val="20"/>
+                <w:color w:val="000000"/>
+              </w:rPr>
+            </w:pPr>
+            <w:r>
+              <w:rPr>
+                <w:rFonts w:ascii="Calibri" w:hAnsi="Calibri" w:eastAsia="Calibri" w:cs="Calibri"/>
+                <w:i w:val="false"/>
+                <w:b w:val="false"/>
+                <w:u w:val="none"/>
+                <w:strike w:val="false"/>
+                <w:sz w:val="20"/>
+                <w:szCs w:val="20"/>
+                <w:color w:val="000000"/>
+              </w:rPr>
+              <w:t xml:space="preserve">-0.86 [-2.77, 1.05]</w:t>
+            </w:r>
+          </w:p>
+        </w:tc>
+        <w:tc>
+          <w:tcPr>
+            <w:tcBorders>
+              <w:bottom w:val="single" w:sz="4" w:space="0" w:color="BDC3C7"/>
+              <w:top w:val="single" w:sz="4" w:space="0" w:color="BDC3C7"/>
+              <w:left w:val="none" w:sz="0" w:space="0" w:color="000000"/>
+              <w:right w:val="none" w:sz="0" w:space="0" w:color="000000"/>
+            </w:tcBorders>
+            <w:shd w:val="clear" w:color="auto" w:fill="F9F9F9"/>
+            <w:tcMar>
+              <w:top w:w="0" w:type="dxa"/>
+              <w:bottom w:w="0" w:type="dxa"/>
+              <w:left w:w="0" w:type="dxa"/>
+              <w:right w:w="0" w:type="dxa"/>
+            </w:tcMar>
+            <w:vAlign w:val="center"/>
+          </w:tcPr>
+          <w:p>
+            <w:pPr>
+              <w:pStyle w:val="Normal"/>
+              <w:jc w:val="center"/>
+              <w:pBdr>
+                <w:bottom w:val="none" w:sz="0" w:space="0" w:color="000000"/>
+                <w:top w:val="none" w:sz="0" w:space="0" w:color="000000"/>
+                <w:left w:val="none" w:sz="0" w:space="0" w:color="000000"/>
+                <w:right w:val="none" w:sz="0" w:space="0" w:color="000000"/>
+              </w:pBdr>
+              <w:spacing w:after="40" w:before="40" w:line="240"/>
+              <w:ind w:left="100" w:right="100" w:firstLine="0" w:firstLineChars="0"/>
+              <w:rPr>
+                <w:rFonts w:ascii="Calibri" w:hAnsi="Calibri" w:eastAsia="Calibri" w:cs="Calibri"/>
+                <w:i w:val="false"/>
+                <w:b w:val="false"/>
+                <w:u w:val="none"/>
+                <w:strike w:val="false"/>
+                <w:sz w:val="20"/>
+                <w:szCs w:val="20"/>
+                <w:color w:val="000000"/>
+              </w:rPr>
+            </w:pPr>
+            <w:r>
+              <w:rPr>
+                <w:rFonts w:ascii="Calibri" w:hAnsi="Calibri" w:eastAsia="Calibri" w:cs="Calibri"/>
+                <w:i w:val="false"/>
+                <w:b w:val="false"/>
+                <w:u w:val="none"/>
+                <w:strike w:val="false"/>
+                <w:sz w:val="20"/>
+                <w:szCs w:val="20"/>
+                <w:color w:val="000000"/>
+              </w:rPr>
+              <w:t xml:space="preserve">2,677.6</w:t>
+            </w:r>
+          </w:p>
+        </w:tc>
+        <w:tc>
+          <w:tcPr>
+            <w:tcBorders>
+              <w:bottom w:val="single" w:sz="4" w:space="0" w:color="BDC3C7"/>
+              <w:top w:val="single" w:sz="4" w:space="0" w:color="BDC3C7"/>
+              <w:left w:val="none" w:sz="0" w:space="0" w:color="000000"/>
+              <w:right w:val="none" w:sz="0" w:space="0" w:color="000000"/>
+            </w:tcBorders>
+            <w:shd w:val="clear" w:color="auto" w:fill="F9F9F9"/>
+            <w:tcMar>
+              <w:top w:w="0" w:type="dxa"/>
+              <w:bottom w:w="0" w:type="dxa"/>
+              <w:left w:w="0" w:type="dxa"/>
+              <w:right w:w="0" w:type="dxa"/>
+            </w:tcMar>
+            <w:vAlign w:val="center"/>
+          </w:tcPr>
+          <w:p>
+            <w:pPr>
+              <w:pStyle w:val="Normal"/>
+              <w:jc w:val="center"/>
+              <w:pBdr>
+                <w:bottom w:val="none" w:sz="0" w:space="0" w:color="000000"/>
+                <w:top w:val="none" w:sz="0" w:space="0" w:color="000000"/>
+                <w:left w:val="none" w:sz="0" w:space="0" w:color="000000"/>
+                <w:right w:val="none" w:sz="0" w:space="0" w:color="000000"/>
+              </w:pBdr>
+              <w:spacing w:after="40" w:before="40" w:line="240"/>
+              <w:ind w:left="100" w:right="100" w:firstLine="0" w:firstLineChars="0"/>
+              <w:rPr>
+                <w:rFonts w:ascii="Calibri" w:hAnsi="Calibri" w:eastAsia="Calibri" w:cs="Calibri"/>
+                <w:i w:val="false"/>
+                <w:b w:val="false"/>
+                <w:u w:val="none"/>
+                <w:strike w:val="false"/>
+                <w:sz w:val="20"/>
+                <w:szCs w:val="20"/>
+                <w:color w:val="8C8C8C"/>
+              </w:rPr>
+            </w:pPr>
+            <w:r>
+              <w:rPr>
+                <w:rFonts w:ascii="Calibri" w:hAnsi="Calibri" w:eastAsia="Calibri" w:cs="Calibri"/>
+                <w:i w:val="false"/>
+                <w:b w:val="false"/>
+                <w:u w:val="none"/>
+                <w:strike w:val="false"/>
+                <w:sz w:val="20"/>
+                <w:szCs w:val="20"/>
+                <w:color w:val="8C8C8C"/>
+              </w:rPr>
+              <w:t xml:space="preserve">0.377</w:t>
+            </w:r>
+          </w:p>
+        </w:tc>
+      </w:tr>
+      <w:tr>
+        <w:trPr>
+          <w:trHeight w:val="360" w:hRule="auto"/>
+        </w:trPr>
+        <w:tc>
+          <w:tcPr>
+            <w:tcBorders>
+              <w:bottom w:val="single" w:sz="4" w:space="0" w:color="BDC3C7"/>
+              <w:top w:val="single" w:sz="4" w:space="0" w:color="BDC3C7"/>
+              <w:left w:val="none" w:sz="0" w:space="0" w:color="000000"/>
+              <w:right w:val="none" w:sz="0" w:space="0" w:color="000000"/>
+            </w:tcBorders>
+            <w:shd w:val="clear" w:color="auto" w:fill="F9F9F9"/>
+            <w:tcMar>
+              <w:top w:w="0" w:type="dxa"/>
+              <w:bottom w:w="0" w:type="dxa"/>
+              <w:left w:w="0" w:type="dxa"/>
+              <w:right w:w="0" w:type="dxa"/>
+            </w:tcMar>
+            <w:vAlign w:val="center"/>
+          </w:tcPr>
+          <w:p>
+            <w:pPr>
+              <w:pStyle w:val="Normal"/>
+              <w:jc w:val="left"/>
+              <w:pBdr>
+                <w:bottom w:val="none" w:sz="0" w:space="0" w:color="000000"/>
+                <w:top w:val="none" w:sz="0" w:space="0" w:color="000000"/>
+                <w:left w:val="none" w:sz="0" w:space="0" w:color="000000"/>
+                <w:right w:val="none" w:sz="0" w:space="0" w:color="000000"/>
+              </w:pBdr>
+              <w:spacing w:after="40" w:before="40" w:line="240"/>
+              <w:ind w:left="100" w:right="100" w:firstLine="0" w:firstLineChars="0"/>
+              <w:rPr>
+                <w:rFonts w:ascii="Calibri" w:hAnsi="Calibri" w:eastAsia="Calibri" w:cs="Calibri"/>
+                <w:i w:val="false"/>
+                <w:b w:val="false"/>
+                <w:u w:val="none"/>
+                <w:strike w:val="false"/>
+                <w:sz w:val="20"/>
+                <w:szCs w:val="20"/>
+                <w:color w:val="000000"/>
+              </w:rPr>
+            </w:pPr>
+            <w:r>
+              <w:rPr>
+                <w:rFonts w:ascii="Calibri" w:hAnsi="Calibri" w:eastAsia="Calibri" w:cs="Calibri"/>
+                <w:i w:val="false"/>
+                <w:b w:val="false"/>
+                <w:u w:val="none"/>
+                <w:strike w:val="false"/>
+                <w:sz w:val="20"/>
+                <w:szCs w:val="20"/>
+                <w:color w:val="000000"/>
+              </w:rPr>
+              <w:t xml:space="preserve">Excessive time in water management: Yes (ref: No)</w:t>
+            </w:r>
+          </w:p>
+        </w:tc>
+        <w:tc>
+          <w:tcPr>
+            <w:tcBorders>
+              <w:bottom w:val="single" w:sz="4" w:space="0" w:color="BDC3C7"/>
+              <w:top w:val="single" w:sz="4" w:space="0" w:color="BDC3C7"/>
+              <w:left w:val="none" w:sz="0" w:space="0" w:color="000000"/>
+              <w:right w:val="none" w:sz="0" w:space="0" w:color="000000"/>
+            </w:tcBorders>
+            <w:shd w:val="clear" w:color="auto" w:fill="F9F9F9"/>
+            <w:tcMar>
+              <w:top w:w="0" w:type="dxa"/>
+              <w:bottom w:w="0" w:type="dxa"/>
+              <w:left w:w="0" w:type="dxa"/>
+              <w:right w:w="0" w:type="dxa"/>
+            </w:tcMar>
+            <w:vAlign w:val="center"/>
+          </w:tcPr>
+          <w:p>
+            <w:pPr>
+              <w:pStyle w:val="Normal"/>
+              <w:jc w:val="center"/>
+              <w:pBdr>
+                <w:bottom w:val="none" w:sz="0" w:space="0" w:color="000000"/>
+                <w:top w:val="none" w:sz="0" w:space="0" w:color="000000"/>
+                <w:left w:val="none" w:sz="0" w:space="0" w:color="000000"/>
+                <w:right w:val="none" w:sz="0" w:space="0" w:color="000000"/>
+              </w:pBdr>
+              <w:spacing w:after="40" w:before="40" w:line="240"/>
+              <w:ind w:left="100" w:right="100" w:firstLine="0" w:firstLineChars="0"/>
+              <w:rPr>
+                <w:rFonts w:ascii="Calibri" w:hAnsi="Calibri" w:eastAsia="Calibri" w:cs="Calibri"/>
+                <w:i w:val="false"/>
+                <w:b w:val="false"/>
+                <w:u w:val="none"/>
+                <w:strike w:val="false"/>
+                <w:sz w:val="20"/>
+                <w:szCs w:val="20"/>
+                <w:color w:val="000000"/>
+              </w:rPr>
+            </w:pPr>
+            <w:r>
+              <w:rPr>
+                <w:rFonts w:ascii="Calibri" w:hAnsi="Calibri" w:eastAsia="Calibri" w:cs="Calibri"/>
+                <w:i w:val="false"/>
+                <w:b w:val="false"/>
+                <w:u w:val="none"/>
+                <w:strike w:val="false"/>
+                <w:sz w:val="20"/>
+                <w:szCs w:val="20"/>
+                <w:color w:val="000000"/>
+              </w:rPr>
+              <w:t xml:space="preserve">383</w:t>
+            </w:r>
+          </w:p>
+        </w:tc>
+        <w:tc>
+          <w:tcPr>
+            <w:tcBorders>
+              <w:bottom w:val="single" w:sz="4" w:space="0" w:color="BDC3C7"/>
+              <w:top w:val="single" w:sz="4" w:space="0" w:color="BDC3C7"/>
+              <w:left w:val="none" w:sz="0" w:space="0" w:color="000000"/>
+              <w:right w:val="none" w:sz="0" w:space="0" w:color="000000"/>
+            </w:tcBorders>
+            <w:shd w:val="clear" w:color="auto" w:fill="F9F9F9"/>
+            <w:tcMar>
+              <w:top w:w="0" w:type="dxa"/>
+              <w:bottom w:w="0" w:type="dxa"/>
+              <w:left w:w="0" w:type="dxa"/>
+              <w:right w:w="0" w:type="dxa"/>
+            </w:tcMar>
+            <w:vAlign w:val="center"/>
+          </w:tcPr>
+          <w:p>
+            <w:pPr>
+              <w:pStyle w:val="Normal"/>
+              <w:jc w:val="center"/>
+              <w:pBdr>
+                <w:bottom w:val="none" w:sz="0" w:space="0" w:color="000000"/>
+                <w:top w:val="none" w:sz="0" w:space="0" w:color="000000"/>
+                <w:left w:val="none" w:sz="0" w:space="0" w:color="000000"/>
+                <w:right w:val="none" w:sz="0" w:space="0" w:color="000000"/>
+              </w:pBdr>
+              <w:spacing w:after="40" w:before="40" w:line="240"/>
+              <w:ind w:left="100" w:right="100" w:firstLine="0" w:firstLineChars="0"/>
+              <w:rPr>
+                <w:rFonts w:ascii="Calibri" w:hAnsi="Calibri" w:eastAsia="Calibri" w:cs="Calibri"/>
+                <w:i w:val="false"/>
+                <w:b w:val="false"/>
+                <w:u w:val="none"/>
+                <w:strike w:val="false"/>
+                <w:sz w:val="20"/>
+                <w:szCs w:val="20"/>
+                <w:color w:val="000000"/>
+              </w:rPr>
+            </w:pPr>
+            <w:r>
+              <w:rPr>
+                <w:rFonts w:ascii="Calibri" w:hAnsi="Calibri" w:eastAsia="Calibri" w:cs="Calibri"/>
+                <w:i w:val="false"/>
+                <w:b w:val="false"/>
+                <w:u w:val="none"/>
+                <w:strike w:val="false"/>
+                <w:sz w:val="20"/>
+                <w:szCs w:val="20"/>
+                <w:color w:val="000000"/>
+              </w:rPr>
+              <w:t xml:space="preserve">0.98 [-0.56, 2.52]</w:t>
+            </w:r>
+          </w:p>
+        </w:tc>
+        <w:tc>
+          <w:tcPr>
+            <w:tcBorders>
+              <w:bottom w:val="single" w:sz="4" w:space="0" w:color="BDC3C7"/>
+              <w:top w:val="single" w:sz="4" w:space="0" w:color="BDC3C7"/>
+              <w:left w:val="none" w:sz="0" w:space="0" w:color="000000"/>
+              <w:right w:val="none" w:sz="0" w:space="0" w:color="000000"/>
+            </w:tcBorders>
+            <w:shd w:val="clear" w:color="auto" w:fill="F9F9F9"/>
+            <w:tcMar>
+              <w:top w:w="0" w:type="dxa"/>
+              <w:bottom w:w="0" w:type="dxa"/>
+              <w:left w:w="0" w:type="dxa"/>
+              <w:right w:w="0" w:type="dxa"/>
+            </w:tcMar>
+            <w:vAlign w:val="center"/>
+          </w:tcPr>
+          <w:p>
+            <w:pPr>
+              <w:pStyle w:val="Normal"/>
+              <w:jc w:val="center"/>
+              <w:pBdr>
+                <w:bottom w:val="none" w:sz="0" w:space="0" w:color="000000"/>
+                <w:top w:val="none" w:sz="0" w:space="0" w:color="000000"/>
+                <w:left w:val="none" w:sz="0" w:space="0" w:color="000000"/>
+                <w:right w:val="none" w:sz="0" w:space="0" w:color="000000"/>
+              </w:pBdr>
+              <w:spacing w:after="40" w:before="40" w:line="240"/>
+              <w:ind w:left="100" w:right="100" w:firstLine="0" w:firstLineChars="0"/>
+              <w:rPr>
+                <w:rFonts w:ascii="Calibri" w:hAnsi="Calibri" w:eastAsia="Calibri" w:cs="Calibri"/>
+                <w:i w:val="false"/>
+                <w:b w:val="false"/>
+                <w:u w:val="none"/>
+                <w:strike w:val="false"/>
+                <w:sz w:val="20"/>
+                <w:szCs w:val="20"/>
+                <w:color w:val="000000"/>
+              </w:rPr>
+            </w:pPr>
+            <w:r>
+              <w:rPr>
+                <w:rFonts w:ascii="Calibri" w:hAnsi="Calibri" w:eastAsia="Calibri" w:cs="Calibri"/>
+                <w:i w:val="false"/>
+                <w:b w:val="false"/>
+                <w:u w:val="none"/>
+                <w:strike w:val="false"/>
+                <w:sz w:val="20"/>
+                <w:szCs w:val="20"/>
+                <w:color w:val="000000"/>
+              </w:rPr>
+              <w:t xml:space="preserve">2,610.7</w:t>
+            </w:r>
+          </w:p>
+        </w:tc>
+        <w:tc>
+          <w:tcPr>
+            <w:tcBorders>
+              <w:bottom w:val="single" w:sz="4" w:space="0" w:color="BDC3C7"/>
+              <w:top w:val="single" w:sz="4" w:space="0" w:color="BDC3C7"/>
+              <w:left w:val="none" w:sz="0" w:space="0" w:color="000000"/>
+              <w:right w:val="none" w:sz="0" w:space="0" w:color="000000"/>
+            </w:tcBorders>
+            <w:shd w:val="clear" w:color="auto" w:fill="F9F9F9"/>
+            <w:tcMar>
+              <w:top w:w="0" w:type="dxa"/>
+              <w:bottom w:w="0" w:type="dxa"/>
+              <w:left w:w="0" w:type="dxa"/>
+              <w:right w:w="0" w:type="dxa"/>
+            </w:tcMar>
+            <w:vAlign w:val="center"/>
+          </w:tcPr>
+          <w:p>
+            <w:pPr>
+              <w:pStyle w:val="Normal"/>
+              <w:jc w:val="center"/>
+              <w:pBdr>
+                <w:bottom w:val="none" w:sz="0" w:space="0" w:color="000000"/>
+                <w:top w:val="none" w:sz="0" w:space="0" w:color="000000"/>
+                <w:left w:val="none" w:sz="0" w:space="0" w:color="000000"/>
+                <w:right w:val="none" w:sz="0" w:space="0" w:color="000000"/>
+              </w:pBdr>
+              <w:spacing w:after="40" w:before="40" w:line="240"/>
+              <w:ind w:left="100" w:right="100" w:firstLine="0" w:firstLineChars="0"/>
+              <w:rPr>
+                <w:rFonts w:ascii="Calibri" w:hAnsi="Calibri" w:eastAsia="Calibri" w:cs="Calibri"/>
+                <w:i w:val="false"/>
+                <w:b w:val="false"/>
+                <w:u w:val="none"/>
+                <w:strike w:val="false"/>
+                <w:sz w:val="20"/>
+                <w:szCs w:val="20"/>
+                <w:color w:val="8C8C8C"/>
+              </w:rPr>
+            </w:pPr>
+            <w:r>
+              <w:rPr>
+                <w:rFonts w:ascii="Calibri" w:hAnsi="Calibri" w:eastAsia="Calibri" w:cs="Calibri"/>
+                <w:i w:val="false"/>
+                <w:b w:val="false"/>
+                <w:u w:val="none"/>
+                <w:strike w:val="false"/>
+                <w:sz w:val="20"/>
+                <w:szCs w:val="20"/>
+                <w:color w:val="8C8C8C"/>
+              </w:rPr>
+              <w:t xml:space="preserve">0.213</w:t>
+            </w:r>
+          </w:p>
+        </w:tc>
+      </w:tr>
+      <w:tr>
+        <w:trPr>
+          <w:trHeight w:val="360" w:hRule="auto"/>
+        </w:trPr>
+        <w:tc>
+          <w:tcPr>
+            <w:tcBorders>
+              <w:bottom w:val="single" w:sz="4" w:space="0" w:color="BDC3C7"/>
+              <w:top w:val="single" w:sz="4" w:space="0" w:color="BDC3C7"/>
+              <w:left w:val="none" w:sz="0" w:space="0" w:color="000000"/>
+              <w:right w:val="none" w:sz="0" w:space="0" w:color="000000"/>
+            </w:tcBorders>
+            <w:shd w:val="clear" w:color="auto" w:fill="F9F9F9"/>
+            <w:tcMar>
+              <w:top w:w="0" w:type="dxa"/>
+              <w:bottom w:w="0" w:type="dxa"/>
+              <w:left w:w="0" w:type="dxa"/>
+              <w:right w:w="0" w:type="dxa"/>
+            </w:tcMar>
+            <w:vAlign w:val="center"/>
+          </w:tcPr>
+          <w:p>
+            <w:pPr>
+              <w:pStyle w:val="Normal"/>
+              <w:jc w:val="left"/>
+              <w:pBdr>
+                <w:bottom w:val="none" w:sz="0" w:space="0" w:color="000000"/>
+                <w:top w:val="none" w:sz="0" w:space="0" w:color="000000"/>
+                <w:left w:val="none" w:sz="0" w:space="0" w:color="000000"/>
+                <w:right w:val="none" w:sz="0" w:space="0" w:color="000000"/>
+              </w:pBdr>
+              <w:spacing w:after="40" w:before="40" w:line="240"/>
+              <w:ind w:left="100" w:right="100" w:firstLine="0" w:firstLineChars="0"/>
+              <w:rPr>
+                <w:rFonts w:ascii="Calibri" w:hAnsi="Calibri" w:eastAsia="Calibri" w:cs="Calibri"/>
+                <w:i w:val="false"/>
+                <w:b w:val="false"/>
+                <w:u w:val="none"/>
+                <w:strike w:val="false"/>
+                <w:sz w:val="20"/>
+                <w:szCs w:val="20"/>
+                <w:color w:val="000000"/>
+              </w:rPr>
+            </w:pPr>
+            <w:r>
+              <w:rPr>
+                <w:rFonts w:ascii="Calibri" w:hAnsi="Calibri" w:eastAsia="Calibri" w:cs="Calibri"/>
+                <w:i w:val="false"/>
+                <w:b w:val="false"/>
+                <w:u w:val="none"/>
+                <w:strike w:val="false"/>
+                <w:sz w:val="20"/>
+                <w:szCs w:val="20"/>
+                <w:color w:val="000000"/>
+              </w:rPr>
+              <w:t xml:space="preserve">Water sufficiency rating (1–4)</w:t>
+            </w:r>
+          </w:p>
+        </w:tc>
+        <w:tc>
+          <w:tcPr>
+            <w:tcBorders>
+              <w:bottom w:val="single" w:sz="4" w:space="0" w:color="BDC3C7"/>
+              <w:top w:val="single" w:sz="4" w:space="0" w:color="BDC3C7"/>
+              <w:left w:val="none" w:sz="0" w:space="0" w:color="000000"/>
+              <w:right w:val="none" w:sz="0" w:space="0" w:color="000000"/>
+            </w:tcBorders>
+            <w:shd w:val="clear" w:color="auto" w:fill="F9F9F9"/>
+            <w:tcMar>
+              <w:top w:w="0" w:type="dxa"/>
+              <w:bottom w:w="0" w:type="dxa"/>
+              <w:left w:w="0" w:type="dxa"/>
+              <w:right w:w="0" w:type="dxa"/>
+            </w:tcMar>
+            <w:vAlign w:val="center"/>
+          </w:tcPr>
+          <w:p>
+            <w:pPr>
+              <w:pStyle w:val="Normal"/>
+              <w:jc w:val="center"/>
+              <w:pBdr>
+                <w:bottom w:val="none" w:sz="0" w:space="0" w:color="000000"/>
+                <w:top w:val="none" w:sz="0" w:space="0" w:color="000000"/>
+                <w:left w:val="none" w:sz="0" w:space="0" w:color="000000"/>
+                <w:right w:val="none" w:sz="0" w:space="0" w:color="000000"/>
+              </w:pBdr>
+              <w:spacing w:after="40" w:before="40" w:line="240"/>
+              <w:ind w:left="100" w:right="100" w:firstLine="0" w:firstLineChars="0"/>
+              <w:rPr>
+                <w:rFonts w:ascii="Calibri" w:hAnsi="Calibri" w:eastAsia="Calibri" w:cs="Calibri"/>
+                <w:i w:val="false"/>
+                <w:b w:val="false"/>
+                <w:u w:val="none"/>
+                <w:strike w:val="false"/>
+                <w:sz w:val="20"/>
+                <w:szCs w:val="20"/>
+                <w:color w:val="000000"/>
+              </w:rPr>
+            </w:pPr>
+            <w:r>
+              <w:rPr>
+                <w:rFonts w:ascii="Calibri" w:hAnsi="Calibri" w:eastAsia="Calibri" w:cs="Calibri"/>
+                <w:i w:val="false"/>
+                <w:b w:val="false"/>
+                <w:u w:val="none"/>
+                <w:strike w:val="false"/>
+                <w:sz w:val="20"/>
+                <w:szCs w:val="20"/>
+                <w:color w:val="000000"/>
+              </w:rPr>
+              <w:t xml:space="preserve">390</w:t>
+            </w:r>
+          </w:p>
+        </w:tc>
+        <w:tc>
+          <w:tcPr>
+            <w:tcBorders>
+              <w:bottom w:val="single" w:sz="4" w:space="0" w:color="BDC3C7"/>
+              <w:top w:val="single" w:sz="4" w:space="0" w:color="BDC3C7"/>
+              <w:left w:val="none" w:sz="0" w:space="0" w:color="000000"/>
+              <w:right w:val="none" w:sz="0" w:space="0" w:color="000000"/>
+            </w:tcBorders>
+            <w:shd w:val="clear" w:color="auto" w:fill="F9F9F9"/>
+            <w:tcMar>
+              <w:top w:w="0" w:type="dxa"/>
+              <w:bottom w:w="0" w:type="dxa"/>
+              <w:left w:w="0" w:type="dxa"/>
+              <w:right w:w="0" w:type="dxa"/>
+            </w:tcMar>
+            <w:vAlign w:val="center"/>
+          </w:tcPr>
+          <w:p>
+            <w:pPr>
+              <w:pStyle w:val="Normal"/>
+              <w:jc w:val="center"/>
+              <w:pBdr>
+                <w:bottom w:val="none" w:sz="0" w:space="0" w:color="000000"/>
+                <w:top w:val="none" w:sz="0" w:space="0" w:color="000000"/>
+                <w:left w:val="none" w:sz="0" w:space="0" w:color="000000"/>
+                <w:right w:val="none" w:sz="0" w:space="0" w:color="000000"/>
+              </w:pBdr>
+              <w:spacing w:after="40" w:before="40" w:line="240"/>
+              <w:ind w:left="100" w:right="100" w:firstLine="0" w:firstLineChars="0"/>
+              <w:rPr>
+                <w:rFonts w:ascii="Calibri" w:hAnsi="Calibri" w:eastAsia="Calibri" w:cs="Calibri"/>
+                <w:i w:val="false"/>
+                <w:b w:val="false"/>
+                <w:u w:val="none"/>
+                <w:strike w:val="false"/>
+                <w:sz w:val="20"/>
+                <w:szCs w:val="20"/>
+                <w:color w:val="000000"/>
+              </w:rPr>
+            </w:pPr>
+            <w:r>
+              <w:rPr>
+                <w:rFonts w:ascii="Calibri" w:hAnsi="Calibri" w:eastAsia="Calibri" w:cs="Calibri"/>
+                <w:i w:val="false"/>
+                <w:b w:val="false"/>
+                <w:u w:val="none"/>
+                <w:strike w:val="false"/>
+                <w:sz w:val="20"/>
+                <w:szCs w:val="20"/>
+                <w:color w:val="000000"/>
+              </w:rPr>
+              <w:t xml:space="preserve">-0.54 [-1.26, 0.18]</w:t>
+            </w:r>
+          </w:p>
+        </w:tc>
+        <w:tc>
+          <w:tcPr>
+            <w:tcBorders>
+              <w:bottom w:val="single" w:sz="4" w:space="0" w:color="BDC3C7"/>
+              <w:top w:val="single" w:sz="4" w:space="0" w:color="BDC3C7"/>
+              <w:left w:val="none" w:sz="0" w:space="0" w:color="000000"/>
+              <w:right w:val="none" w:sz="0" w:space="0" w:color="000000"/>
+            </w:tcBorders>
+            <w:shd w:val="clear" w:color="auto" w:fill="F9F9F9"/>
+            <w:tcMar>
+              <w:top w:w="0" w:type="dxa"/>
+              <w:bottom w:w="0" w:type="dxa"/>
+              <w:left w:w="0" w:type="dxa"/>
+              <w:right w:w="0" w:type="dxa"/>
+            </w:tcMar>
+            <w:vAlign w:val="center"/>
+          </w:tcPr>
+          <w:p>
+            <w:pPr>
+              <w:pStyle w:val="Normal"/>
+              <w:jc w:val="center"/>
+              <w:pBdr>
+                <w:bottom w:val="none" w:sz="0" w:space="0" w:color="000000"/>
+                <w:top w:val="none" w:sz="0" w:space="0" w:color="000000"/>
+                <w:left w:val="none" w:sz="0" w:space="0" w:color="000000"/>
+                <w:right w:val="none" w:sz="0" w:space="0" w:color="000000"/>
+              </w:pBdr>
+              <w:spacing w:after="40" w:before="40" w:line="240"/>
+              <w:ind w:left="100" w:right="100" w:firstLine="0" w:firstLineChars="0"/>
+              <w:rPr>
+                <w:rFonts w:ascii="Calibri" w:hAnsi="Calibri" w:eastAsia="Calibri" w:cs="Calibri"/>
+                <w:i w:val="false"/>
+                <w:b w:val="false"/>
+                <w:u w:val="none"/>
+                <w:strike w:val="false"/>
+                <w:sz w:val="20"/>
+                <w:szCs w:val="20"/>
+                <w:color w:val="000000"/>
+              </w:rPr>
+            </w:pPr>
+            <w:r>
+              <w:rPr>
+                <w:rFonts w:ascii="Calibri" w:hAnsi="Calibri" w:eastAsia="Calibri" w:cs="Calibri"/>
+                <w:i w:val="false"/>
+                <w:b w:val="false"/>
+                <w:u w:val="none"/>
+                <w:strike w:val="false"/>
+                <w:sz w:val="20"/>
+                <w:szCs w:val="20"/>
+                <w:color w:val="000000"/>
+              </w:rPr>
+              <w:t xml:space="preserve">2,644.9</w:t>
+            </w:r>
+          </w:p>
+        </w:tc>
+        <w:tc>
+          <w:tcPr>
+            <w:tcBorders>
+              <w:bottom w:val="single" w:sz="4" w:space="0" w:color="BDC3C7"/>
+              <w:top w:val="single" w:sz="4" w:space="0" w:color="BDC3C7"/>
+              <w:left w:val="none" w:sz="0" w:space="0" w:color="000000"/>
+              <w:right w:val="none" w:sz="0" w:space="0" w:color="000000"/>
+            </w:tcBorders>
+            <w:shd w:val="clear" w:color="auto" w:fill="F9F9F9"/>
+            <w:tcMar>
+              <w:top w:w="0" w:type="dxa"/>
+              <w:bottom w:w="0" w:type="dxa"/>
+              <w:left w:w="0" w:type="dxa"/>
+              <w:right w:w="0" w:type="dxa"/>
+            </w:tcMar>
+            <w:vAlign w:val="center"/>
+          </w:tcPr>
+          <w:p>
+            <w:pPr>
+              <w:pStyle w:val="Normal"/>
+              <w:jc w:val="center"/>
+              <w:pBdr>
+                <w:bottom w:val="none" w:sz="0" w:space="0" w:color="000000"/>
+                <w:top w:val="none" w:sz="0" w:space="0" w:color="000000"/>
+                <w:left w:val="none" w:sz="0" w:space="0" w:color="000000"/>
+                <w:right w:val="none" w:sz="0" w:space="0" w:color="000000"/>
+              </w:pBdr>
+              <w:spacing w:after="40" w:before="40" w:line="240"/>
+              <w:ind w:left="100" w:right="100" w:firstLine="0" w:firstLineChars="0"/>
+              <w:rPr>
+                <w:rFonts w:ascii="Calibri" w:hAnsi="Calibri" w:eastAsia="Calibri" w:cs="Calibri"/>
+                <w:i w:val="false"/>
+                <w:b w:val="false"/>
+                <w:u w:val="none"/>
+                <w:strike w:val="false"/>
+                <w:sz w:val="20"/>
+                <w:szCs w:val="20"/>
+                <w:color w:val="8C8C8C"/>
+              </w:rPr>
+            </w:pPr>
+            <w:r>
+              <w:rPr>
+                <w:rFonts w:ascii="Calibri" w:hAnsi="Calibri" w:eastAsia="Calibri" w:cs="Calibri"/>
+                <w:i w:val="false"/>
+                <w:b w:val="false"/>
+                <w:u w:val="none"/>
+                <w:strike w:val="false"/>
+                <w:sz w:val="20"/>
+                <w:szCs w:val="20"/>
+                <w:color w:val="8C8C8C"/>
+              </w:rPr>
+              <w:t xml:space="preserve">0.144</w:t>
             </w:r>
           </w:p>
         </w:tc>
@@ -24807,6 +25927,1126 @@
                 <w:color w:val="000000"/>
               </w:rPr>
               <w:t xml:space="preserve">429.5</w:t>
+            </w:r>
+          </w:p>
+        </w:tc>
+        <w:tc>
+          <w:tcPr>
+            <w:tcBorders>
+              <w:bottom w:val="single" w:sz="4" w:space="0" w:color="BDC3C7"/>
+              <w:top w:val="single" w:sz="4" w:space="0" w:color="BDC3C7"/>
+              <w:left w:val="none" w:sz="0" w:space="0" w:color="000000"/>
+              <w:right w:val="none" w:sz="0" w:space="0" w:color="000000"/>
+            </w:tcBorders>
+            <w:shd w:val="clear" w:color="auto" w:fill="D5F5E3"/>
+            <w:tcMar>
+              <w:top w:w="0" w:type="dxa"/>
+              <w:bottom w:w="0" w:type="dxa"/>
+              <w:left w:w="0" w:type="dxa"/>
+              <w:right w:w="0" w:type="dxa"/>
+            </w:tcMar>
+            <w:vAlign w:val="center"/>
+          </w:tcPr>
+          <w:p>
+            <w:pPr>
+              <w:pStyle w:val="Normal"/>
+              <w:jc w:val="center"/>
+              <w:pBdr>
+                <w:bottom w:val="none" w:sz="0" w:space="0" w:color="000000"/>
+                <w:top w:val="none" w:sz="0" w:space="0" w:color="000000"/>
+                <w:left w:val="none" w:sz="0" w:space="0" w:color="000000"/>
+                <w:right w:val="none" w:sz="0" w:space="0" w:color="000000"/>
+              </w:pBdr>
+              <w:spacing w:after="40" w:before="40" w:line="240"/>
+              <w:ind w:left="100" w:right="100" w:firstLine="0" w:firstLineChars="0"/>
+              <w:rPr>
+                <w:rFonts w:ascii="Calibri" w:hAnsi="Calibri" w:eastAsia="Calibri" w:cs="Calibri"/>
+                <w:i w:val="false"/>
+                <w:b w:val="true"/>
+                <w:u w:val="none"/>
+                <w:strike w:val="false"/>
+                <w:sz w:val="20"/>
+                <w:szCs w:val="20"/>
+                <w:color w:val="1E8449"/>
+              </w:rPr>
+            </w:pPr>
+            <w:r>
+              <w:rPr>
+                <w:rFonts w:ascii="Calibri" w:hAnsi="Calibri" w:eastAsia="Calibri" w:cs="Calibri"/>
+                <w:i w:val="false"/>
+                <w:b w:val="true"/>
+                <w:u w:val="none"/>
+                <w:strike w:val="false"/>
+                <w:sz w:val="20"/>
+                <w:szCs w:val="20"/>
+                <w:color w:val="1E8449"/>
+              </w:rPr>
+              <w:t xml:space="preserve">&lt;0.001</w:t>
+            </w:r>
+          </w:p>
+        </w:tc>
+      </w:tr>
+      <w:tr>
+        <w:trPr>
+          <w:trHeight w:val="360" w:hRule="auto"/>
+        </w:trPr>
+        <w:tc>
+          <w:tcPr>
+            <w:tcBorders>
+              <w:bottom w:val="single" w:sz="4" w:space="0" w:color="BDC3C7"/>
+              <w:top w:val="single" w:sz="4" w:space="0" w:color="BDC3C7"/>
+              <w:left w:val="none" w:sz="0" w:space="0" w:color="000000"/>
+              <w:right w:val="none" w:sz="0" w:space="0" w:color="000000"/>
+            </w:tcBorders>
+            <w:shd w:val="clear" w:color="auto" w:fill="D5F5E3"/>
+            <w:tcMar>
+              <w:top w:w="0" w:type="dxa"/>
+              <w:bottom w:w="0" w:type="dxa"/>
+              <w:left w:w="0" w:type="dxa"/>
+              <w:right w:w="0" w:type="dxa"/>
+            </w:tcMar>
+            <w:vAlign w:val="center"/>
+          </w:tcPr>
+          <w:p>
+            <w:pPr>
+              <w:pStyle w:val="Normal"/>
+              <w:jc w:val="left"/>
+              <w:pBdr>
+                <w:bottom w:val="none" w:sz="0" w:space="0" w:color="000000"/>
+                <w:top w:val="none" w:sz="0" w:space="0" w:color="000000"/>
+                <w:left w:val="none" w:sz="0" w:space="0" w:color="000000"/>
+                <w:right w:val="none" w:sz="0" w:space="0" w:color="000000"/>
+              </w:pBdr>
+              <w:spacing w:after="40" w:before="40" w:line="240"/>
+              <w:ind w:left="100" w:right="100" w:firstLine="0" w:firstLineChars="0"/>
+              <w:rPr>
+                <w:rFonts w:ascii="Calibri" w:hAnsi="Calibri" w:eastAsia="Calibri" w:cs="Calibri"/>
+                <w:i w:val="false"/>
+                <w:b w:val="false"/>
+                <w:u w:val="none"/>
+                <w:strike w:val="false"/>
+                <w:sz w:val="20"/>
+                <w:szCs w:val="20"/>
+                <w:color w:val="000000"/>
+              </w:rPr>
+            </w:pPr>
+            <w:r>
+              <w:rPr>
+                <w:rFonts w:ascii="Calibri" w:hAnsi="Calibri" w:eastAsia="Calibri" w:cs="Calibri"/>
+                <w:i w:val="false"/>
+                <w:b w:val="false"/>
+                <w:u w:val="none"/>
+                <w:strike w:val="false"/>
+                <w:sz w:val="20"/>
+                <w:szCs w:val="20"/>
+                <w:color w:val="000000"/>
+              </w:rPr>
+              <w:t xml:space="preserve">Neighborhood water quality vs. own: Same (ref: Better)</w:t>
+            </w:r>
+          </w:p>
+        </w:tc>
+        <w:tc>
+          <w:tcPr>
+            <w:tcBorders>
+              <w:bottom w:val="single" w:sz="4" w:space="0" w:color="BDC3C7"/>
+              <w:top w:val="single" w:sz="4" w:space="0" w:color="BDC3C7"/>
+              <w:left w:val="none" w:sz="0" w:space="0" w:color="000000"/>
+              <w:right w:val="none" w:sz="0" w:space="0" w:color="000000"/>
+            </w:tcBorders>
+            <w:shd w:val="clear" w:color="auto" w:fill="D5F5E3"/>
+            <w:tcMar>
+              <w:top w:w="0" w:type="dxa"/>
+              <w:bottom w:w="0" w:type="dxa"/>
+              <w:left w:w="0" w:type="dxa"/>
+              <w:right w:w="0" w:type="dxa"/>
+            </w:tcMar>
+            <w:vAlign w:val="center"/>
+          </w:tcPr>
+          <w:p>
+            <w:pPr>
+              <w:pStyle w:val="Normal"/>
+              <w:jc w:val="center"/>
+              <w:pBdr>
+                <w:bottom w:val="none" w:sz="0" w:space="0" w:color="000000"/>
+                <w:top w:val="none" w:sz="0" w:space="0" w:color="000000"/>
+                <w:left w:val="none" w:sz="0" w:space="0" w:color="000000"/>
+                <w:right w:val="none" w:sz="0" w:space="0" w:color="000000"/>
+              </w:pBdr>
+              <w:spacing w:after="40" w:before="40" w:line="240"/>
+              <w:ind w:left="100" w:right="100" w:firstLine="0" w:firstLineChars="0"/>
+              <w:rPr>
+                <w:rFonts w:ascii="Calibri" w:hAnsi="Calibri" w:eastAsia="Calibri" w:cs="Calibri"/>
+                <w:i w:val="false"/>
+                <w:b w:val="false"/>
+                <w:u w:val="none"/>
+                <w:strike w:val="false"/>
+                <w:sz w:val="20"/>
+                <w:szCs w:val="20"/>
+                <w:color w:val="000000"/>
+              </w:rPr>
+            </w:pPr>
+            <w:r>
+              <w:rPr>
+                <w:rFonts w:ascii="Calibri" w:hAnsi="Calibri" w:eastAsia="Calibri" w:cs="Calibri"/>
+                <w:i w:val="false"/>
+                <w:b w:val="false"/>
+                <w:u w:val="none"/>
+                <w:strike w:val="false"/>
+                <w:sz w:val="20"/>
+                <w:szCs w:val="20"/>
+                <w:color w:val="000000"/>
+              </w:rPr>
+              <w:t xml:space="preserve">360</w:t>
+            </w:r>
+          </w:p>
+        </w:tc>
+        <w:tc>
+          <w:tcPr>
+            <w:tcBorders>
+              <w:bottom w:val="single" w:sz="4" w:space="0" w:color="BDC3C7"/>
+              <w:top w:val="single" w:sz="4" w:space="0" w:color="BDC3C7"/>
+              <w:left w:val="none" w:sz="0" w:space="0" w:color="000000"/>
+              <w:right w:val="none" w:sz="0" w:space="0" w:color="000000"/>
+            </w:tcBorders>
+            <w:shd w:val="clear" w:color="auto" w:fill="D5F5E3"/>
+            <w:tcMar>
+              <w:top w:w="0" w:type="dxa"/>
+              <w:bottom w:w="0" w:type="dxa"/>
+              <w:left w:w="0" w:type="dxa"/>
+              <w:right w:w="0" w:type="dxa"/>
+            </w:tcMar>
+            <w:vAlign w:val="center"/>
+          </w:tcPr>
+          <w:p>
+            <w:pPr>
+              <w:pStyle w:val="Normal"/>
+              <w:jc w:val="center"/>
+              <w:pBdr>
+                <w:bottom w:val="none" w:sz="0" w:space="0" w:color="000000"/>
+                <w:top w:val="none" w:sz="0" w:space="0" w:color="000000"/>
+                <w:left w:val="none" w:sz="0" w:space="0" w:color="000000"/>
+                <w:right w:val="none" w:sz="0" w:space="0" w:color="000000"/>
+              </w:pBdr>
+              <w:spacing w:after="40" w:before="40" w:line="240"/>
+              <w:ind w:left="100" w:right="100" w:firstLine="0" w:firstLineChars="0"/>
+              <w:rPr>
+                <w:rFonts w:ascii="Calibri" w:hAnsi="Calibri" w:eastAsia="Calibri" w:cs="Calibri"/>
+                <w:i w:val="false"/>
+                <w:b w:val="false"/>
+                <w:u w:val="none"/>
+                <w:strike w:val="false"/>
+                <w:sz w:val="20"/>
+                <w:szCs w:val="20"/>
+                <w:color w:val="000000"/>
+              </w:rPr>
+            </w:pPr>
+            <w:r>
+              <w:rPr>
+                <w:rFonts w:ascii="Calibri" w:hAnsi="Calibri" w:eastAsia="Calibri" w:cs="Calibri"/>
+                <w:i w:val="false"/>
+                <w:b w:val="false"/>
+                <w:u w:val="none"/>
+                <w:strike w:val="false"/>
+                <w:sz w:val="20"/>
+                <w:szCs w:val="20"/>
+                <w:color w:val="000000"/>
+              </w:rPr>
+              <w:t xml:space="preserve">2.22 [1.29, 3.85]</w:t>
+            </w:r>
+          </w:p>
+        </w:tc>
+        <w:tc>
+          <w:tcPr>
+            <w:tcBorders>
+              <w:bottom w:val="single" w:sz="4" w:space="0" w:color="BDC3C7"/>
+              <w:top w:val="single" w:sz="4" w:space="0" w:color="BDC3C7"/>
+              <w:left w:val="none" w:sz="0" w:space="0" w:color="000000"/>
+              <w:right w:val="none" w:sz="0" w:space="0" w:color="000000"/>
+            </w:tcBorders>
+            <w:shd w:val="clear" w:color="auto" w:fill="D5F5E3"/>
+            <w:tcMar>
+              <w:top w:w="0" w:type="dxa"/>
+              <w:bottom w:w="0" w:type="dxa"/>
+              <w:left w:w="0" w:type="dxa"/>
+              <w:right w:w="0" w:type="dxa"/>
+            </w:tcMar>
+            <w:vAlign w:val="center"/>
+          </w:tcPr>
+          <w:p>
+            <w:pPr>
+              <w:pStyle w:val="Normal"/>
+              <w:jc w:val="center"/>
+              <w:pBdr>
+                <w:bottom w:val="none" w:sz="0" w:space="0" w:color="000000"/>
+                <w:top w:val="none" w:sz="0" w:space="0" w:color="000000"/>
+                <w:left w:val="none" w:sz="0" w:space="0" w:color="000000"/>
+                <w:right w:val="none" w:sz="0" w:space="0" w:color="000000"/>
+              </w:pBdr>
+              <w:spacing w:after="40" w:before="40" w:line="240"/>
+              <w:ind w:left="100" w:right="100" w:firstLine="0" w:firstLineChars="0"/>
+              <w:rPr>
+                <w:rFonts w:ascii="Calibri" w:hAnsi="Calibri" w:eastAsia="Calibri" w:cs="Calibri"/>
+                <w:i w:val="false"/>
+                <w:b w:val="false"/>
+                <w:u w:val="none"/>
+                <w:strike w:val="false"/>
+                <w:sz w:val="20"/>
+                <w:szCs w:val="20"/>
+                <w:color w:val="000000"/>
+              </w:rPr>
+            </w:pPr>
+            <w:r>
+              <w:rPr>
+                <w:rFonts w:ascii="Calibri" w:hAnsi="Calibri" w:eastAsia="Calibri" w:cs="Calibri"/>
+                <w:i w:val="false"/>
+                <w:b w:val="false"/>
+                <w:u w:val="none"/>
+                <w:strike w:val="false"/>
+                <w:sz w:val="20"/>
+                <w:szCs w:val="20"/>
+                <w:color w:val="000000"/>
+              </w:rPr>
+              <w:t xml:space="preserve">451.6</w:t>
+            </w:r>
+          </w:p>
+        </w:tc>
+        <w:tc>
+          <w:tcPr>
+            <w:tcBorders>
+              <w:bottom w:val="single" w:sz="4" w:space="0" w:color="BDC3C7"/>
+              <w:top w:val="single" w:sz="4" w:space="0" w:color="BDC3C7"/>
+              <w:left w:val="none" w:sz="0" w:space="0" w:color="000000"/>
+              <w:right w:val="none" w:sz="0" w:space="0" w:color="000000"/>
+            </w:tcBorders>
+            <w:shd w:val="clear" w:color="auto" w:fill="D5F5E3"/>
+            <w:tcMar>
+              <w:top w:w="0" w:type="dxa"/>
+              <w:bottom w:w="0" w:type="dxa"/>
+              <w:left w:w="0" w:type="dxa"/>
+              <w:right w:w="0" w:type="dxa"/>
+            </w:tcMar>
+            <w:vAlign w:val="center"/>
+          </w:tcPr>
+          <w:p>
+            <w:pPr>
+              <w:pStyle w:val="Normal"/>
+              <w:jc w:val="center"/>
+              <w:pBdr>
+                <w:bottom w:val="none" w:sz="0" w:space="0" w:color="000000"/>
+                <w:top w:val="none" w:sz="0" w:space="0" w:color="000000"/>
+                <w:left w:val="none" w:sz="0" w:space="0" w:color="000000"/>
+                <w:right w:val="none" w:sz="0" w:space="0" w:color="000000"/>
+              </w:pBdr>
+              <w:spacing w:after="40" w:before="40" w:line="240"/>
+              <w:ind w:left="100" w:right="100" w:firstLine="0" w:firstLineChars="0"/>
+              <w:rPr>
+                <w:rFonts w:ascii="Calibri" w:hAnsi="Calibri" w:eastAsia="Calibri" w:cs="Calibri"/>
+                <w:i w:val="false"/>
+                <w:b w:val="true"/>
+                <w:u w:val="none"/>
+                <w:strike w:val="false"/>
+                <w:sz w:val="20"/>
+                <w:szCs w:val="20"/>
+                <w:color w:val="1E8449"/>
+              </w:rPr>
+            </w:pPr>
+            <w:r>
+              <w:rPr>
+                <w:rFonts w:ascii="Calibri" w:hAnsi="Calibri" w:eastAsia="Calibri" w:cs="Calibri"/>
+                <w:i w:val="false"/>
+                <w:b w:val="true"/>
+                <w:u w:val="none"/>
+                <w:strike w:val="false"/>
+                <w:sz w:val="20"/>
+                <w:szCs w:val="20"/>
+                <w:color w:val="1E8449"/>
+              </w:rPr>
+              <w:t xml:space="preserve">0.004</w:t>
+            </w:r>
+          </w:p>
+        </w:tc>
+      </w:tr>
+      <w:tr>
+        <w:trPr>
+          <w:trHeight w:val="360" w:hRule="auto"/>
+        </w:trPr>
+        <w:tc>
+          <w:tcPr>
+            <w:tcBorders>
+              <w:bottom w:val="single" w:sz="4" w:space="0" w:color="BDC3C7"/>
+              <w:top w:val="single" w:sz="4" w:space="0" w:color="BDC3C7"/>
+              <w:left w:val="none" w:sz="0" w:space="0" w:color="000000"/>
+              <w:right w:val="none" w:sz="0" w:space="0" w:color="000000"/>
+            </w:tcBorders>
+            <w:shd w:val="clear" w:color="auto" w:fill="D5F5E3"/>
+            <w:tcMar>
+              <w:top w:w="0" w:type="dxa"/>
+              <w:bottom w:w="0" w:type="dxa"/>
+              <w:left w:w="0" w:type="dxa"/>
+              <w:right w:w="0" w:type="dxa"/>
+            </w:tcMar>
+            <w:vAlign w:val="center"/>
+          </w:tcPr>
+          <w:p>
+            <w:pPr>
+              <w:pStyle w:val="Normal"/>
+              <w:jc w:val="left"/>
+              <w:pBdr>
+                <w:bottom w:val="none" w:sz="0" w:space="0" w:color="000000"/>
+                <w:top w:val="none" w:sz="0" w:space="0" w:color="000000"/>
+                <w:left w:val="none" w:sz="0" w:space="0" w:color="000000"/>
+                <w:right w:val="none" w:sz="0" w:space="0" w:color="000000"/>
+              </w:pBdr>
+              <w:spacing w:after="40" w:before="40" w:line="240"/>
+              <w:ind w:left="100" w:right="100" w:firstLine="0" w:firstLineChars="0"/>
+              <w:rPr>
+                <w:rFonts w:ascii="Calibri" w:hAnsi="Calibri" w:eastAsia="Calibri" w:cs="Calibri"/>
+                <w:i w:val="false"/>
+                <w:b w:val="false"/>
+                <w:u w:val="none"/>
+                <w:strike w:val="false"/>
+                <w:sz w:val="20"/>
+                <w:szCs w:val="20"/>
+                <w:color w:val="000000"/>
+              </w:rPr>
+            </w:pPr>
+            <w:r>
+              <w:rPr>
+                <w:rFonts w:ascii="Calibri" w:hAnsi="Calibri" w:eastAsia="Calibri" w:cs="Calibri"/>
+                <w:i w:val="false"/>
+                <w:b w:val="false"/>
+                <w:u w:val="none"/>
+                <w:strike w:val="false"/>
+                <w:sz w:val="20"/>
+                <w:szCs w:val="20"/>
+                <w:color w:val="000000"/>
+              </w:rPr>
+              <w:t xml:space="preserve">Neighborhood water quality vs. own: Worse (ref: Better)</w:t>
+            </w:r>
+          </w:p>
+        </w:tc>
+        <w:tc>
+          <w:tcPr>
+            <w:tcBorders>
+              <w:bottom w:val="single" w:sz="4" w:space="0" w:color="BDC3C7"/>
+              <w:top w:val="single" w:sz="4" w:space="0" w:color="BDC3C7"/>
+              <w:left w:val="none" w:sz="0" w:space="0" w:color="000000"/>
+              <w:right w:val="none" w:sz="0" w:space="0" w:color="000000"/>
+            </w:tcBorders>
+            <w:shd w:val="clear" w:color="auto" w:fill="D5F5E3"/>
+            <w:tcMar>
+              <w:top w:w="0" w:type="dxa"/>
+              <w:bottom w:w="0" w:type="dxa"/>
+              <w:left w:w="0" w:type="dxa"/>
+              <w:right w:w="0" w:type="dxa"/>
+            </w:tcMar>
+            <w:vAlign w:val="center"/>
+          </w:tcPr>
+          <w:p>
+            <w:pPr>
+              <w:pStyle w:val="Normal"/>
+              <w:jc w:val="center"/>
+              <w:pBdr>
+                <w:bottom w:val="none" w:sz="0" w:space="0" w:color="000000"/>
+                <w:top w:val="none" w:sz="0" w:space="0" w:color="000000"/>
+                <w:left w:val="none" w:sz="0" w:space="0" w:color="000000"/>
+                <w:right w:val="none" w:sz="0" w:space="0" w:color="000000"/>
+              </w:pBdr>
+              <w:spacing w:after="40" w:before="40" w:line="240"/>
+              <w:ind w:left="100" w:right="100" w:firstLine="0" w:firstLineChars="0"/>
+              <w:rPr>
+                <w:rFonts w:ascii="Calibri" w:hAnsi="Calibri" w:eastAsia="Calibri" w:cs="Calibri"/>
+                <w:i w:val="false"/>
+                <w:b w:val="false"/>
+                <w:u w:val="none"/>
+                <w:strike w:val="false"/>
+                <w:sz w:val="20"/>
+                <w:szCs w:val="20"/>
+                <w:color w:val="000000"/>
+              </w:rPr>
+            </w:pPr>
+            <w:r>
+              <w:rPr>
+                <w:rFonts w:ascii="Calibri" w:hAnsi="Calibri" w:eastAsia="Calibri" w:cs="Calibri"/>
+                <w:i w:val="false"/>
+                <w:b w:val="false"/>
+                <w:u w:val="none"/>
+                <w:strike w:val="false"/>
+                <w:sz w:val="20"/>
+                <w:szCs w:val="20"/>
+                <w:color w:val="000000"/>
+              </w:rPr>
+              <w:t xml:space="preserve">360</w:t>
+            </w:r>
+          </w:p>
+        </w:tc>
+        <w:tc>
+          <w:tcPr>
+            <w:tcBorders>
+              <w:bottom w:val="single" w:sz="4" w:space="0" w:color="BDC3C7"/>
+              <w:top w:val="single" w:sz="4" w:space="0" w:color="BDC3C7"/>
+              <w:left w:val="none" w:sz="0" w:space="0" w:color="000000"/>
+              <w:right w:val="none" w:sz="0" w:space="0" w:color="000000"/>
+            </w:tcBorders>
+            <w:shd w:val="clear" w:color="auto" w:fill="D5F5E3"/>
+            <w:tcMar>
+              <w:top w:w="0" w:type="dxa"/>
+              <w:bottom w:w="0" w:type="dxa"/>
+              <w:left w:w="0" w:type="dxa"/>
+              <w:right w:w="0" w:type="dxa"/>
+            </w:tcMar>
+            <w:vAlign w:val="center"/>
+          </w:tcPr>
+          <w:p>
+            <w:pPr>
+              <w:pStyle w:val="Normal"/>
+              <w:jc w:val="center"/>
+              <w:pBdr>
+                <w:bottom w:val="none" w:sz="0" w:space="0" w:color="000000"/>
+                <w:top w:val="none" w:sz="0" w:space="0" w:color="000000"/>
+                <w:left w:val="none" w:sz="0" w:space="0" w:color="000000"/>
+                <w:right w:val="none" w:sz="0" w:space="0" w:color="000000"/>
+              </w:pBdr>
+              <w:spacing w:after="40" w:before="40" w:line="240"/>
+              <w:ind w:left="100" w:right="100" w:firstLine="0" w:firstLineChars="0"/>
+              <w:rPr>
+                <w:rFonts w:ascii="Calibri" w:hAnsi="Calibri" w:eastAsia="Calibri" w:cs="Calibri"/>
+                <w:i w:val="false"/>
+                <w:b w:val="false"/>
+                <w:u w:val="none"/>
+                <w:strike w:val="false"/>
+                <w:sz w:val="20"/>
+                <w:szCs w:val="20"/>
+                <w:color w:val="000000"/>
+              </w:rPr>
+            </w:pPr>
+            <w:r>
+              <w:rPr>
+                <w:rFonts w:ascii="Calibri" w:hAnsi="Calibri" w:eastAsia="Calibri" w:cs="Calibri"/>
+                <w:i w:val="false"/>
+                <w:b w:val="false"/>
+                <w:u w:val="none"/>
+                <w:strike w:val="false"/>
+                <w:sz w:val="20"/>
+                <w:szCs w:val="20"/>
+                <w:color w:val="000000"/>
+              </w:rPr>
+              <w:t xml:space="preserve">3.58 [2.01, 6.48]</w:t>
+            </w:r>
+          </w:p>
+        </w:tc>
+        <w:tc>
+          <w:tcPr>
+            <w:tcBorders>
+              <w:bottom w:val="single" w:sz="4" w:space="0" w:color="BDC3C7"/>
+              <w:top w:val="single" w:sz="4" w:space="0" w:color="BDC3C7"/>
+              <w:left w:val="none" w:sz="0" w:space="0" w:color="000000"/>
+              <w:right w:val="none" w:sz="0" w:space="0" w:color="000000"/>
+            </w:tcBorders>
+            <w:shd w:val="clear" w:color="auto" w:fill="D5F5E3"/>
+            <w:tcMar>
+              <w:top w:w="0" w:type="dxa"/>
+              <w:bottom w:w="0" w:type="dxa"/>
+              <w:left w:w="0" w:type="dxa"/>
+              <w:right w:w="0" w:type="dxa"/>
+            </w:tcMar>
+            <w:vAlign w:val="center"/>
+          </w:tcPr>
+          <w:p>
+            <w:pPr>
+              <w:pStyle w:val="Normal"/>
+              <w:jc w:val="center"/>
+              <w:pBdr>
+                <w:bottom w:val="none" w:sz="0" w:space="0" w:color="000000"/>
+                <w:top w:val="none" w:sz="0" w:space="0" w:color="000000"/>
+                <w:left w:val="none" w:sz="0" w:space="0" w:color="000000"/>
+                <w:right w:val="none" w:sz="0" w:space="0" w:color="000000"/>
+              </w:pBdr>
+              <w:spacing w:after="40" w:before="40" w:line="240"/>
+              <w:ind w:left="100" w:right="100" w:firstLine="0" w:firstLineChars="0"/>
+              <w:rPr>
+                <w:rFonts w:ascii="Calibri" w:hAnsi="Calibri" w:eastAsia="Calibri" w:cs="Calibri"/>
+                <w:i w:val="false"/>
+                <w:b w:val="false"/>
+                <w:u w:val="none"/>
+                <w:strike w:val="false"/>
+                <w:sz w:val="20"/>
+                <w:szCs w:val="20"/>
+                <w:color w:val="000000"/>
+              </w:rPr>
+            </w:pPr>
+            <w:r>
+              <w:rPr>
+                <w:rFonts w:ascii="Calibri" w:hAnsi="Calibri" w:eastAsia="Calibri" w:cs="Calibri"/>
+                <w:i w:val="false"/>
+                <w:b w:val="false"/>
+                <w:u w:val="none"/>
+                <w:strike w:val="false"/>
+                <w:sz w:val="20"/>
+                <w:szCs w:val="20"/>
+                <w:color w:val="000000"/>
+              </w:rPr>
+              <w:t xml:space="preserve">451.6</w:t>
+            </w:r>
+          </w:p>
+        </w:tc>
+        <w:tc>
+          <w:tcPr>
+            <w:tcBorders>
+              <w:bottom w:val="single" w:sz="4" w:space="0" w:color="BDC3C7"/>
+              <w:top w:val="single" w:sz="4" w:space="0" w:color="BDC3C7"/>
+              <w:left w:val="none" w:sz="0" w:space="0" w:color="000000"/>
+              <w:right w:val="none" w:sz="0" w:space="0" w:color="000000"/>
+            </w:tcBorders>
+            <w:shd w:val="clear" w:color="auto" w:fill="D5F5E3"/>
+            <w:tcMar>
+              <w:top w:w="0" w:type="dxa"/>
+              <w:bottom w:w="0" w:type="dxa"/>
+              <w:left w:w="0" w:type="dxa"/>
+              <w:right w:w="0" w:type="dxa"/>
+            </w:tcMar>
+            <w:vAlign w:val="center"/>
+          </w:tcPr>
+          <w:p>
+            <w:pPr>
+              <w:pStyle w:val="Normal"/>
+              <w:jc w:val="center"/>
+              <w:pBdr>
+                <w:bottom w:val="none" w:sz="0" w:space="0" w:color="000000"/>
+                <w:top w:val="none" w:sz="0" w:space="0" w:color="000000"/>
+                <w:left w:val="none" w:sz="0" w:space="0" w:color="000000"/>
+                <w:right w:val="none" w:sz="0" w:space="0" w:color="000000"/>
+              </w:pBdr>
+              <w:spacing w:after="40" w:before="40" w:line="240"/>
+              <w:ind w:left="100" w:right="100" w:firstLine="0" w:firstLineChars="0"/>
+              <w:rPr>
+                <w:rFonts w:ascii="Calibri" w:hAnsi="Calibri" w:eastAsia="Calibri" w:cs="Calibri"/>
+                <w:i w:val="false"/>
+                <w:b w:val="true"/>
+                <w:u w:val="none"/>
+                <w:strike w:val="false"/>
+                <w:sz w:val="20"/>
+                <w:szCs w:val="20"/>
+                <w:color w:val="1E8449"/>
+              </w:rPr>
+            </w:pPr>
+            <w:r>
+              <w:rPr>
+                <w:rFonts w:ascii="Calibri" w:hAnsi="Calibri" w:eastAsia="Calibri" w:cs="Calibri"/>
+                <w:i w:val="false"/>
+                <w:b w:val="true"/>
+                <w:u w:val="none"/>
+                <w:strike w:val="false"/>
+                <w:sz w:val="20"/>
+                <w:szCs w:val="20"/>
+                <w:color w:val="1E8449"/>
+              </w:rPr>
+              <w:t xml:space="preserve">&lt;0.001</w:t>
+            </w:r>
+          </w:p>
+        </w:tc>
+      </w:tr>
+      <w:tr>
+        <w:trPr>
+          <w:trHeight w:val="360" w:hRule="auto"/>
+        </w:trPr>
+        <w:tc>
+          <w:tcPr>
+            <w:tcBorders>
+              <w:bottom w:val="single" w:sz="4" w:space="0" w:color="BDC3C7"/>
+              <w:top w:val="single" w:sz="4" w:space="0" w:color="BDC3C7"/>
+              <w:left w:val="none" w:sz="0" w:space="0" w:color="000000"/>
+              <w:right w:val="none" w:sz="0" w:space="0" w:color="000000"/>
+            </w:tcBorders>
+            <w:shd w:val="clear" w:color="auto" w:fill="D5F5E3"/>
+            <w:tcMar>
+              <w:top w:w="0" w:type="dxa"/>
+              <w:bottom w:w="0" w:type="dxa"/>
+              <w:left w:w="0" w:type="dxa"/>
+              <w:right w:w="0" w:type="dxa"/>
+            </w:tcMar>
+            <w:vAlign w:val="center"/>
+          </w:tcPr>
+          <w:p>
+            <w:pPr>
+              <w:pStyle w:val="Normal"/>
+              <w:jc w:val="left"/>
+              <w:pBdr>
+                <w:bottom w:val="none" w:sz="0" w:space="0" w:color="000000"/>
+                <w:top w:val="none" w:sz="0" w:space="0" w:color="000000"/>
+                <w:left w:val="none" w:sz="0" w:space="0" w:color="000000"/>
+                <w:right w:val="none" w:sz="0" w:space="0" w:color="000000"/>
+              </w:pBdr>
+              <w:spacing w:after="40" w:before="40" w:line="240"/>
+              <w:ind w:left="100" w:right="100" w:firstLine="0" w:firstLineChars="0"/>
+              <w:rPr>
+                <w:rFonts w:ascii="Calibri" w:hAnsi="Calibri" w:eastAsia="Calibri" w:cs="Calibri"/>
+                <w:i w:val="false"/>
+                <w:b w:val="false"/>
+                <w:u w:val="none"/>
+                <w:strike w:val="false"/>
+                <w:sz w:val="20"/>
+                <w:szCs w:val="20"/>
+                <w:color w:val="000000"/>
+              </w:rPr>
+            </w:pPr>
+            <w:r>
+              <w:rPr>
+                <w:rFonts w:ascii="Calibri" w:hAnsi="Calibri" w:eastAsia="Calibri" w:cs="Calibri"/>
+                <w:i w:val="false"/>
+                <w:b w:val="false"/>
+                <w:u w:val="none"/>
+                <w:strike w:val="false"/>
+                <w:sz w:val="20"/>
+                <w:szCs w:val="20"/>
+                <w:color w:val="000000"/>
+              </w:rPr>
+              <w:t xml:space="preserve">Excessive time in water management: Yes (ref: No)</w:t>
+            </w:r>
+          </w:p>
+        </w:tc>
+        <w:tc>
+          <w:tcPr>
+            <w:tcBorders>
+              <w:bottom w:val="single" w:sz="4" w:space="0" w:color="BDC3C7"/>
+              <w:top w:val="single" w:sz="4" w:space="0" w:color="BDC3C7"/>
+              <w:left w:val="none" w:sz="0" w:space="0" w:color="000000"/>
+              <w:right w:val="none" w:sz="0" w:space="0" w:color="000000"/>
+            </w:tcBorders>
+            <w:shd w:val="clear" w:color="auto" w:fill="D5F5E3"/>
+            <w:tcMar>
+              <w:top w:w="0" w:type="dxa"/>
+              <w:bottom w:w="0" w:type="dxa"/>
+              <w:left w:w="0" w:type="dxa"/>
+              <w:right w:w="0" w:type="dxa"/>
+            </w:tcMar>
+            <w:vAlign w:val="center"/>
+          </w:tcPr>
+          <w:p>
+            <w:pPr>
+              <w:pStyle w:val="Normal"/>
+              <w:jc w:val="center"/>
+              <w:pBdr>
+                <w:bottom w:val="none" w:sz="0" w:space="0" w:color="000000"/>
+                <w:top w:val="none" w:sz="0" w:space="0" w:color="000000"/>
+                <w:left w:val="none" w:sz="0" w:space="0" w:color="000000"/>
+                <w:right w:val="none" w:sz="0" w:space="0" w:color="000000"/>
+              </w:pBdr>
+              <w:spacing w:after="40" w:before="40" w:line="240"/>
+              <w:ind w:left="100" w:right="100" w:firstLine="0" w:firstLineChars="0"/>
+              <w:rPr>
+                <w:rFonts w:ascii="Calibri" w:hAnsi="Calibri" w:eastAsia="Calibri" w:cs="Calibri"/>
+                <w:i w:val="false"/>
+                <w:b w:val="false"/>
+                <w:u w:val="none"/>
+                <w:strike w:val="false"/>
+                <w:sz w:val="20"/>
+                <w:szCs w:val="20"/>
+                <w:color w:val="000000"/>
+              </w:rPr>
+            </w:pPr>
+            <w:r>
+              <w:rPr>
+                <w:rFonts w:ascii="Calibri" w:hAnsi="Calibri" w:eastAsia="Calibri" w:cs="Calibri"/>
+                <w:i w:val="false"/>
+                <w:b w:val="false"/>
+                <w:u w:val="none"/>
+                <w:strike w:val="false"/>
+                <w:sz w:val="20"/>
+                <w:szCs w:val="20"/>
+                <w:color w:val="000000"/>
+              </w:rPr>
+              <w:t xml:space="preserve">351</w:t>
+            </w:r>
+          </w:p>
+        </w:tc>
+        <w:tc>
+          <w:tcPr>
+            <w:tcBorders>
+              <w:bottom w:val="single" w:sz="4" w:space="0" w:color="BDC3C7"/>
+              <w:top w:val="single" w:sz="4" w:space="0" w:color="BDC3C7"/>
+              <w:left w:val="none" w:sz="0" w:space="0" w:color="000000"/>
+              <w:right w:val="none" w:sz="0" w:space="0" w:color="000000"/>
+            </w:tcBorders>
+            <w:shd w:val="clear" w:color="auto" w:fill="D5F5E3"/>
+            <w:tcMar>
+              <w:top w:w="0" w:type="dxa"/>
+              <w:bottom w:w="0" w:type="dxa"/>
+              <w:left w:w="0" w:type="dxa"/>
+              <w:right w:w="0" w:type="dxa"/>
+            </w:tcMar>
+            <w:vAlign w:val="center"/>
+          </w:tcPr>
+          <w:p>
+            <w:pPr>
+              <w:pStyle w:val="Normal"/>
+              <w:jc w:val="center"/>
+              <w:pBdr>
+                <w:bottom w:val="none" w:sz="0" w:space="0" w:color="000000"/>
+                <w:top w:val="none" w:sz="0" w:space="0" w:color="000000"/>
+                <w:left w:val="none" w:sz="0" w:space="0" w:color="000000"/>
+                <w:right w:val="none" w:sz="0" w:space="0" w:color="000000"/>
+              </w:pBdr>
+              <w:spacing w:after="40" w:before="40" w:line="240"/>
+              <w:ind w:left="100" w:right="100" w:firstLine="0" w:firstLineChars="0"/>
+              <w:rPr>
+                <w:rFonts w:ascii="Calibri" w:hAnsi="Calibri" w:eastAsia="Calibri" w:cs="Calibri"/>
+                <w:i w:val="false"/>
+                <w:b w:val="false"/>
+                <w:u w:val="none"/>
+                <w:strike w:val="false"/>
+                <w:sz w:val="20"/>
+                <w:szCs w:val="20"/>
+                <w:color w:val="000000"/>
+              </w:rPr>
+            </w:pPr>
+            <w:r>
+              <w:rPr>
+                <w:rFonts w:ascii="Calibri" w:hAnsi="Calibri" w:eastAsia="Calibri" w:cs="Calibri"/>
+                <w:i w:val="false"/>
+                <w:b w:val="false"/>
+                <w:u w:val="none"/>
+                <w:strike w:val="false"/>
+                <w:sz w:val="20"/>
+                <w:szCs w:val="20"/>
+                <w:color w:val="000000"/>
+              </w:rPr>
+              <w:t xml:space="preserve">6.26 [3.53, 11.78]</w:t>
+            </w:r>
+          </w:p>
+        </w:tc>
+        <w:tc>
+          <w:tcPr>
+            <w:tcBorders>
+              <w:bottom w:val="single" w:sz="4" w:space="0" w:color="BDC3C7"/>
+              <w:top w:val="single" w:sz="4" w:space="0" w:color="BDC3C7"/>
+              <w:left w:val="none" w:sz="0" w:space="0" w:color="000000"/>
+              <w:right w:val="none" w:sz="0" w:space="0" w:color="000000"/>
+            </w:tcBorders>
+            <w:shd w:val="clear" w:color="auto" w:fill="D5F5E3"/>
+            <w:tcMar>
+              <w:top w:w="0" w:type="dxa"/>
+              <w:bottom w:w="0" w:type="dxa"/>
+              <w:left w:w="0" w:type="dxa"/>
+              <w:right w:w="0" w:type="dxa"/>
+            </w:tcMar>
+            <w:vAlign w:val="center"/>
+          </w:tcPr>
+          <w:p>
+            <w:pPr>
+              <w:pStyle w:val="Normal"/>
+              <w:jc w:val="center"/>
+              <w:pBdr>
+                <w:bottom w:val="none" w:sz="0" w:space="0" w:color="000000"/>
+                <w:top w:val="none" w:sz="0" w:space="0" w:color="000000"/>
+                <w:left w:val="none" w:sz="0" w:space="0" w:color="000000"/>
+                <w:right w:val="none" w:sz="0" w:space="0" w:color="000000"/>
+              </w:pBdr>
+              <w:spacing w:after="40" w:before="40" w:line="240"/>
+              <w:ind w:left="100" w:right="100" w:firstLine="0" w:firstLineChars="0"/>
+              <w:rPr>
+                <w:rFonts w:ascii="Calibri" w:hAnsi="Calibri" w:eastAsia="Calibri" w:cs="Calibri"/>
+                <w:i w:val="false"/>
+                <w:b w:val="false"/>
+                <w:u w:val="none"/>
+                <w:strike w:val="false"/>
+                <w:sz w:val="20"/>
+                <w:szCs w:val="20"/>
+                <w:color w:val="000000"/>
+              </w:rPr>
+            </w:pPr>
+            <w:r>
+              <w:rPr>
+                <w:rFonts w:ascii="Calibri" w:hAnsi="Calibri" w:eastAsia="Calibri" w:cs="Calibri"/>
+                <w:i w:val="false"/>
+                <w:b w:val="false"/>
+                <w:u w:val="none"/>
+                <w:strike w:val="false"/>
+                <w:sz w:val="20"/>
+                <w:szCs w:val="20"/>
+                <w:color w:val="000000"/>
+              </w:rPr>
+              <w:t xml:space="preserve">410.2</w:t>
+            </w:r>
+          </w:p>
+        </w:tc>
+        <w:tc>
+          <w:tcPr>
+            <w:tcBorders>
+              <w:bottom w:val="single" w:sz="4" w:space="0" w:color="BDC3C7"/>
+              <w:top w:val="single" w:sz="4" w:space="0" w:color="BDC3C7"/>
+              <w:left w:val="none" w:sz="0" w:space="0" w:color="000000"/>
+              <w:right w:val="none" w:sz="0" w:space="0" w:color="000000"/>
+            </w:tcBorders>
+            <w:shd w:val="clear" w:color="auto" w:fill="D5F5E3"/>
+            <w:tcMar>
+              <w:top w:w="0" w:type="dxa"/>
+              <w:bottom w:w="0" w:type="dxa"/>
+              <w:left w:w="0" w:type="dxa"/>
+              <w:right w:w="0" w:type="dxa"/>
+            </w:tcMar>
+            <w:vAlign w:val="center"/>
+          </w:tcPr>
+          <w:p>
+            <w:pPr>
+              <w:pStyle w:val="Normal"/>
+              <w:jc w:val="center"/>
+              <w:pBdr>
+                <w:bottom w:val="none" w:sz="0" w:space="0" w:color="000000"/>
+                <w:top w:val="none" w:sz="0" w:space="0" w:color="000000"/>
+                <w:left w:val="none" w:sz="0" w:space="0" w:color="000000"/>
+                <w:right w:val="none" w:sz="0" w:space="0" w:color="000000"/>
+              </w:pBdr>
+              <w:spacing w:after="40" w:before="40" w:line="240"/>
+              <w:ind w:left="100" w:right="100" w:firstLine="0" w:firstLineChars="0"/>
+              <w:rPr>
+                <w:rFonts w:ascii="Calibri" w:hAnsi="Calibri" w:eastAsia="Calibri" w:cs="Calibri"/>
+                <w:i w:val="false"/>
+                <w:b w:val="true"/>
+                <w:u w:val="none"/>
+                <w:strike w:val="false"/>
+                <w:sz w:val="20"/>
+                <w:szCs w:val="20"/>
+                <w:color w:val="1E8449"/>
+              </w:rPr>
+            </w:pPr>
+            <w:r>
+              <w:rPr>
+                <w:rFonts w:ascii="Calibri" w:hAnsi="Calibri" w:eastAsia="Calibri" w:cs="Calibri"/>
+                <w:i w:val="false"/>
+                <w:b w:val="true"/>
+                <w:u w:val="none"/>
+                <w:strike w:val="false"/>
+                <w:sz w:val="20"/>
+                <w:szCs w:val="20"/>
+                <w:color w:val="1E8449"/>
+              </w:rPr>
+              <w:t xml:space="preserve">&lt;0.001</w:t>
+            </w:r>
+          </w:p>
+        </w:tc>
+      </w:tr>
+      <w:tr>
+        <w:trPr>
+          <w:trHeight w:val="360" w:hRule="auto"/>
+        </w:trPr>
+        <w:tc>
+          <w:tcPr>
+            <w:tcBorders>
+              <w:bottom w:val="single" w:sz="4" w:space="0" w:color="BDC3C7"/>
+              <w:top w:val="single" w:sz="4" w:space="0" w:color="BDC3C7"/>
+              <w:left w:val="none" w:sz="0" w:space="0" w:color="000000"/>
+              <w:right w:val="none" w:sz="0" w:space="0" w:color="000000"/>
+            </w:tcBorders>
+            <w:shd w:val="clear" w:color="auto" w:fill="D5F5E3"/>
+            <w:tcMar>
+              <w:top w:w="0" w:type="dxa"/>
+              <w:bottom w:w="0" w:type="dxa"/>
+              <w:left w:w="0" w:type="dxa"/>
+              <w:right w:w="0" w:type="dxa"/>
+            </w:tcMar>
+            <w:vAlign w:val="center"/>
+          </w:tcPr>
+          <w:p>
+            <w:pPr>
+              <w:pStyle w:val="Normal"/>
+              <w:jc w:val="left"/>
+              <w:pBdr>
+                <w:bottom w:val="none" w:sz="0" w:space="0" w:color="000000"/>
+                <w:top w:val="none" w:sz="0" w:space="0" w:color="000000"/>
+                <w:left w:val="none" w:sz="0" w:space="0" w:color="000000"/>
+                <w:right w:val="none" w:sz="0" w:space="0" w:color="000000"/>
+              </w:pBdr>
+              <w:spacing w:after="40" w:before="40" w:line="240"/>
+              <w:ind w:left="100" w:right="100" w:firstLine="0" w:firstLineChars="0"/>
+              <w:rPr>
+                <w:rFonts w:ascii="Calibri" w:hAnsi="Calibri" w:eastAsia="Calibri" w:cs="Calibri"/>
+                <w:i w:val="false"/>
+                <w:b w:val="false"/>
+                <w:u w:val="none"/>
+                <w:strike w:val="false"/>
+                <w:sz w:val="20"/>
+                <w:szCs w:val="20"/>
+                <w:color w:val="000000"/>
+              </w:rPr>
+            </w:pPr>
+            <w:r>
+              <w:rPr>
+                <w:rFonts w:ascii="Calibri" w:hAnsi="Calibri" w:eastAsia="Calibri" w:cs="Calibri"/>
+                <w:i w:val="false"/>
+                <w:b w:val="false"/>
+                <w:u w:val="none"/>
+                <w:strike w:val="false"/>
+                <w:sz w:val="20"/>
+                <w:szCs w:val="20"/>
+                <w:color w:val="000000"/>
+              </w:rPr>
+              <w:t xml:space="preserve">Water sufficiency rating (1–4)</w:t>
+            </w:r>
+          </w:p>
+        </w:tc>
+        <w:tc>
+          <w:tcPr>
+            <w:tcBorders>
+              <w:bottom w:val="single" w:sz="4" w:space="0" w:color="BDC3C7"/>
+              <w:top w:val="single" w:sz="4" w:space="0" w:color="BDC3C7"/>
+              <w:left w:val="none" w:sz="0" w:space="0" w:color="000000"/>
+              <w:right w:val="none" w:sz="0" w:space="0" w:color="000000"/>
+            </w:tcBorders>
+            <w:shd w:val="clear" w:color="auto" w:fill="D5F5E3"/>
+            <w:tcMar>
+              <w:top w:w="0" w:type="dxa"/>
+              <w:bottom w:w="0" w:type="dxa"/>
+              <w:left w:w="0" w:type="dxa"/>
+              <w:right w:w="0" w:type="dxa"/>
+            </w:tcMar>
+            <w:vAlign w:val="center"/>
+          </w:tcPr>
+          <w:p>
+            <w:pPr>
+              <w:pStyle w:val="Normal"/>
+              <w:jc w:val="center"/>
+              <w:pBdr>
+                <w:bottom w:val="none" w:sz="0" w:space="0" w:color="000000"/>
+                <w:top w:val="none" w:sz="0" w:space="0" w:color="000000"/>
+                <w:left w:val="none" w:sz="0" w:space="0" w:color="000000"/>
+                <w:right w:val="none" w:sz="0" w:space="0" w:color="000000"/>
+              </w:pBdr>
+              <w:spacing w:after="40" w:before="40" w:line="240"/>
+              <w:ind w:left="100" w:right="100" w:firstLine="0" w:firstLineChars="0"/>
+              <w:rPr>
+                <w:rFonts w:ascii="Calibri" w:hAnsi="Calibri" w:eastAsia="Calibri" w:cs="Calibri"/>
+                <w:i w:val="false"/>
+                <w:b w:val="false"/>
+                <w:u w:val="none"/>
+                <w:strike w:val="false"/>
+                <w:sz w:val="20"/>
+                <w:szCs w:val="20"/>
+                <w:color w:val="000000"/>
+              </w:rPr>
+            </w:pPr>
+            <w:r>
+              <w:rPr>
+                <w:rFonts w:ascii="Calibri" w:hAnsi="Calibri" w:eastAsia="Calibri" w:cs="Calibri"/>
+                <w:i w:val="false"/>
+                <w:b w:val="false"/>
+                <w:u w:val="none"/>
+                <w:strike w:val="false"/>
+                <w:sz w:val="20"/>
+                <w:szCs w:val="20"/>
+                <w:color w:val="000000"/>
+              </w:rPr>
+              <w:t xml:space="preserve">357</w:t>
+            </w:r>
+          </w:p>
+        </w:tc>
+        <w:tc>
+          <w:tcPr>
+            <w:tcBorders>
+              <w:bottom w:val="single" w:sz="4" w:space="0" w:color="BDC3C7"/>
+              <w:top w:val="single" w:sz="4" w:space="0" w:color="BDC3C7"/>
+              <w:left w:val="none" w:sz="0" w:space="0" w:color="000000"/>
+              <w:right w:val="none" w:sz="0" w:space="0" w:color="000000"/>
+            </w:tcBorders>
+            <w:shd w:val="clear" w:color="auto" w:fill="D5F5E3"/>
+            <w:tcMar>
+              <w:top w:w="0" w:type="dxa"/>
+              <w:bottom w:w="0" w:type="dxa"/>
+              <w:left w:w="0" w:type="dxa"/>
+              <w:right w:w="0" w:type="dxa"/>
+            </w:tcMar>
+            <w:vAlign w:val="center"/>
+          </w:tcPr>
+          <w:p>
+            <w:pPr>
+              <w:pStyle w:val="Normal"/>
+              <w:jc w:val="center"/>
+              <w:pBdr>
+                <w:bottom w:val="none" w:sz="0" w:space="0" w:color="000000"/>
+                <w:top w:val="none" w:sz="0" w:space="0" w:color="000000"/>
+                <w:left w:val="none" w:sz="0" w:space="0" w:color="000000"/>
+                <w:right w:val="none" w:sz="0" w:space="0" w:color="000000"/>
+              </w:pBdr>
+              <w:spacing w:after="40" w:before="40" w:line="240"/>
+              <w:ind w:left="100" w:right="100" w:firstLine="0" w:firstLineChars="0"/>
+              <w:rPr>
+                <w:rFonts w:ascii="Calibri" w:hAnsi="Calibri" w:eastAsia="Calibri" w:cs="Calibri"/>
+                <w:i w:val="false"/>
+                <w:b w:val="false"/>
+                <w:u w:val="none"/>
+                <w:strike w:val="false"/>
+                <w:sz w:val="20"/>
+                <w:szCs w:val="20"/>
+                <w:color w:val="000000"/>
+              </w:rPr>
+            </w:pPr>
+            <w:r>
+              <w:rPr>
+                <w:rFonts w:ascii="Calibri" w:hAnsi="Calibri" w:eastAsia="Calibri" w:cs="Calibri"/>
+                <w:i w:val="false"/>
+                <w:b w:val="false"/>
+                <w:u w:val="none"/>
+                <w:strike w:val="false"/>
+                <w:sz w:val="20"/>
+                <w:szCs w:val="20"/>
+                <w:color w:val="000000"/>
+              </w:rPr>
+              <w:t xml:space="preserve">0.43 [0.32, 0.55]</w:t>
+            </w:r>
+          </w:p>
+        </w:tc>
+        <w:tc>
+          <w:tcPr>
+            <w:tcBorders>
+              <w:bottom w:val="single" w:sz="4" w:space="0" w:color="BDC3C7"/>
+              <w:top w:val="single" w:sz="4" w:space="0" w:color="BDC3C7"/>
+              <w:left w:val="none" w:sz="0" w:space="0" w:color="000000"/>
+              <w:right w:val="none" w:sz="0" w:space="0" w:color="000000"/>
+            </w:tcBorders>
+            <w:shd w:val="clear" w:color="auto" w:fill="D5F5E3"/>
+            <w:tcMar>
+              <w:top w:w="0" w:type="dxa"/>
+              <w:bottom w:w="0" w:type="dxa"/>
+              <w:left w:w="0" w:type="dxa"/>
+              <w:right w:w="0" w:type="dxa"/>
+            </w:tcMar>
+            <w:vAlign w:val="center"/>
+          </w:tcPr>
+          <w:p>
+            <w:pPr>
+              <w:pStyle w:val="Normal"/>
+              <w:jc w:val="center"/>
+              <w:pBdr>
+                <w:bottom w:val="none" w:sz="0" w:space="0" w:color="000000"/>
+                <w:top w:val="none" w:sz="0" w:space="0" w:color="000000"/>
+                <w:left w:val="none" w:sz="0" w:space="0" w:color="000000"/>
+                <w:right w:val="none" w:sz="0" w:space="0" w:color="000000"/>
+              </w:pBdr>
+              <w:spacing w:after="40" w:before="40" w:line="240"/>
+              <w:ind w:left="100" w:right="100" w:firstLine="0" w:firstLineChars="0"/>
+              <w:rPr>
+                <w:rFonts w:ascii="Calibri" w:hAnsi="Calibri" w:eastAsia="Calibri" w:cs="Calibri"/>
+                <w:i w:val="false"/>
+                <w:b w:val="false"/>
+                <w:u w:val="none"/>
+                <w:strike w:val="false"/>
+                <w:sz w:val="20"/>
+                <w:szCs w:val="20"/>
+                <w:color w:val="000000"/>
+              </w:rPr>
+            </w:pPr>
+            <w:r>
+              <w:rPr>
+                <w:rFonts w:ascii="Calibri" w:hAnsi="Calibri" w:eastAsia="Calibri" w:cs="Calibri"/>
+                <w:i w:val="false"/>
+                <w:b w:val="false"/>
+                <w:u w:val="none"/>
+                <w:strike w:val="false"/>
+                <w:sz w:val="20"/>
+                <w:szCs w:val="20"/>
+                <w:color w:val="000000"/>
+              </w:rPr>
+              <w:t xml:space="preserve">418.4</w:t>
             </w:r>
           </w:p>
         </w:tc>

</xml_diff>